<commit_message>
remove duplicated from sorted array
</commit_message>
<xml_diff>
--- a/DSA/JavaStriverDSA/Arrays/StriverSDESheet_Arrays.docx
+++ b/DSA/JavaStriverDSA/Arrays/StriverSDESheet_Arrays.docx
@@ -52,6 +52,10 @@
             <w:rPr>
               <w:rFonts w:asciiTheme="minorHAnsi" w:eastAsiaTheme="minorEastAsia" w:hAnsiTheme="minorHAnsi" w:cstheme="minorBidi"/>
               <w:noProof/>
+              <w:kern w:val="2"/>
+              <w:sz w:val="24"/>
+              <w:szCs w:val="24"/>
+              <w14:ligatures w14:val="standardContextual"/>
             </w:rPr>
           </w:pPr>
           <w:r>
@@ -63,7 +67,7 @@
           <w:r>
             <w:fldChar w:fldCharType="separate"/>
           </w:r>
-          <w:hyperlink w:anchor="_Toc125491502" w:history="1">
+          <w:hyperlink w:anchor="_Toc224137433" w:history="1">
             <w:r>
               <w:rPr>
                 <w:rStyle w:val="Hyperlink"/>
@@ -98,7 +102,7 @@
                 <w:noProof/>
                 <w:webHidden/>
               </w:rPr>
-              <w:instrText xml:space="preserve"> PAGEREF _Toc125491502 \h </w:instrText>
+              <w:instrText xml:space="preserve"> PAGEREF _Toc224137433 \h </w:instrText>
             </w:r>
             <w:r>
               <w:rPr>
@@ -138,9 +142,13 @@
             <w:rPr>
               <w:rFonts w:asciiTheme="minorHAnsi" w:eastAsiaTheme="minorEastAsia" w:hAnsiTheme="minorHAnsi" w:cstheme="minorBidi"/>
               <w:noProof/>
+              <w:kern w:val="2"/>
+              <w:sz w:val="24"/>
+              <w:szCs w:val="24"/>
+              <w14:ligatures w14:val="standardContextual"/>
             </w:rPr>
           </w:pPr>
-          <w:hyperlink w:anchor="_Toc125491503" w:history="1">
+          <w:hyperlink w:anchor="_Toc224137434" w:history="1">
             <w:r>
               <w:rPr>
                 <w:rStyle w:val="Hyperlink"/>
@@ -177,7 +185,7 @@
                 <w:noProof/>
                 <w:webHidden/>
               </w:rPr>
-              <w:instrText xml:space="preserve"> PAGEREF _Toc125491503 \h </w:instrText>
+              <w:instrText xml:space="preserve"> PAGEREF _Toc224137434 \h </w:instrText>
             </w:r>
             <w:r>
               <w:rPr>
@@ -217,9 +225,13 @@
             <w:rPr>
               <w:rFonts w:asciiTheme="minorHAnsi" w:eastAsiaTheme="minorEastAsia" w:hAnsiTheme="minorHAnsi" w:cstheme="minorBidi"/>
               <w:noProof/>
+              <w:kern w:val="2"/>
+              <w:sz w:val="24"/>
+              <w:szCs w:val="24"/>
+              <w14:ligatures w14:val="standardContextual"/>
             </w:rPr>
           </w:pPr>
-          <w:hyperlink w:anchor="_Toc125491504" w:history="1">
+          <w:hyperlink w:anchor="_Toc224137435" w:history="1">
             <w:r>
               <w:rPr>
                 <w:rStyle w:val="Hyperlink"/>
@@ -256,163 +268,7 @@
                 <w:noProof/>
                 <w:webHidden/>
               </w:rPr>
-              <w:instrText xml:space="preserve"> PAGEREF _Toc125491504 \h </w:instrText>
-            </w:r>
-            <w:r>
-              <w:rPr>
-                <w:noProof/>
-                <w:webHidden/>
-              </w:rPr>
-            </w:r>
-            <w:r>
-              <w:rPr>
-                <w:noProof/>
-                <w:webHidden/>
-              </w:rPr>
-              <w:fldChar w:fldCharType="separate"/>
-            </w:r>
-            <w:r>
-              <w:rPr>
-                <w:noProof/>
-                <w:webHidden/>
-              </w:rPr>
-              <w:t>3</w:t>
-            </w:r>
-            <w:r>
-              <w:rPr>
-                <w:noProof/>
-                <w:webHidden/>
-              </w:rPr>
-              <w:fldChar w:fldCharType="end"/>
-            </w:r>
-          </w:hyperlink>
-        </w:p>
-        <w:p>
-          <w:pPr>
-            <w:pStyle w:val="TOC3"/>
-            <w:tabs>
-              <w:tab w:val="right" w:leader="dot" w:pos="9350"/>
-            </w:tabs>
-            <w:rPr>
-              <w:rFonts w:asciiTheme="minorHAnsi" w:eastAsiaTheme="minorEastAsia" w:hAnsiTheme="minorHAnsi" w:cstheme="minorBidi"/>
-              <w:noProof/>
-            </w:rPr>
-          </w:pPr>
-          <w:hyperlink w:anchor="_Toc125491505" w:history="1">
-            <w:r>
-              <w:rPr>
-                <w:rStyle w:val="Hyperlink"/>
-                <w:rFonts w:ascii="Ubuntu" w:hAnsi="Ubuntu"/>
-                <w:noProof/>
-                <w:lang w:val="en-IN"/>
-              </w:rPr>
-              <w:t>1.3</w:t>
-            </w:r>
-            <w:r>
-              <w:rPr>
-                <w:rStyle w:val="Hyperlink"/>
-                <w:noProof/>
-                <w:lang w:val="en-IN"/>
-              </w:rPr>
-              <w:t xml:space="preserve"> Next Permutation</w:t>
-            </w:r>
-            <w:r>
-              <w:rPr>
-                <w:noProof/>
-                <w:webHidden/>
-              </w:rPr>
-              <w:tab/>
-            </w:r>
-            <w:r>
-              <w:rPr>
-                <w:noProof/>
-                <w:webHidden/>
-              </w:rPr>
-              <w:fldChar w:fldCharType="begin"/>
-            </w:r>
-            <w:r>
-              <w:rPr>
-                <w:noProof/>
-                <w:webHidden/>
-              </w:rPr>
-              <w:instrText xml:space="preserve"> PAGEREF _Toc125491505 \h </w:instrText>
-            </w:r>
-            <w:r>
-              <w:rPr>
-                <w:noProof/>
-                <w:webHidden/>
-              </w:rPr>
-            </w:r>
-            <w:r>
-              <w:rPr>
-                <w:noProof/>
-                <w:webHidden/>
-              </w:rPr>
-              <w:fldChar w:fldCharType="separate"/>
-            </w:r>
-            <w:r>
-              <w:rPr>
-                <w:noProof/>
-                <w:webHidden/>
-              </w:rPr>
-              <w:t>4</w:t>
-            </w:r>
-            <w:r>
-              <w:rPr>
-                <w:noProof/>
-                <w:webHidden/>
-              </w:rPr>
-              <w:fldChar w:fldCharType="end"/>
-            </w:r>
-          </w:hyperlink>
-        </w:p>
-        <w:p>
-          <w:pPr>
-            <w:pStyle w:val="TOC3"/>
-            <w:tabs>
-              <w:tab w:val="right" w:leader="dot" w:pos="9350"/>
-            </w:tabs>
-            <w:rPr>
-              <w:rFonts w:asciiTheme="minorHAnsi" w:eastAsiaTheme="minorEastAsia" w:hAnsiTheme="minorHAnsi" w:cstheme="minorBidi"/>
-              <w:noProof/>
-            </w:rPr>
-          </w:pPr>
-          <w:hyperlink w:anchor="_Toc125491506" w:history="1">
-            <w:r>
-              <w:rPr>
-                <w:rStyle w:val="Hyperlink"/>
-                <w:rFonts w:ascii="Ubuntu" w:hAnsi="Ubuntu"/>
-                <w:noProof/>
-              </w:rPr>
-              <w:t>1.4</w:t>
-            </w:r>
-            <w:r>
-              <w:rPr>
-                <w:rStyle w:val="Hyperlink"/>
-                <w:noProof/>
-              </w:rPr>
-              <w:t xml:space="preserve"> Kadane’s Algorithm</w:t>
-            </w:r>
-            <w:r>
-              <w:rPr>
-                <w:noProof/>
-                <w:webHidden/>
-              </w:rPr>
-              <w:tab/>
-            </w:r>
-            <w:r>
-              <w:rPr>
-                <w:noProof/>
-                <w:webHidden/>
-              </w:rPr>
-              <w:fldChar w:fldCharType="begin"/>
-            </w:r>
-            <w:r>
-              <w:rPr>
-                <w:noProof/>
-                <w:webHidden/>
-              </w:rPr>
-              <w:instrText xml:space="preserve"> PAGEREF _Toc125491506 \h </w:instrText>
+              <w:instrText xml:space="preserve"> PAGEREF _Toc224137435 \h </w:instrText>
             </w:r>
             <w:r>
               <w:rPr>
@@ -452,23 +308,29 @@
             <w:rPr>
               <w:rFonts w:asciiTheme="minorHAnsi" w:eastAsiaTheme="minorEastAsia" w:hAnsiTheme="minorHAnsi" w:cstheme="minorBidi"/>
               <w:noProof/>
+              <w:kern w:val="2"/>
+              <w:sz w:val="24"/>
+              <w:szCs w:val="24"/>
+              <w14:ligatures w14:val="standardContextual"/>
             </w:rPr>
           </w:pPr>
-          <w:hyperlink w:anchor="_Toc125491507" w:history="1">
+          <w:hyperlink w:anchor="_Toc224137436" w:history="1">
             <w:r>
               <w:rPr>
                 <w:rStyle w:val="Hyperlink"/>
                 <w:rFonts w:ascii="Ubuntu" w:hAnsi="Ubuntu"/>
                 <w:noProof/>
+                <w:lang w:val="en-IN"/>
               </w:rPr>
-              <w:t>1.5</w:t>
+              <w:t>1.3</w:t>
             </w:r>
             <w:r>
               <w:rPr>
                 <w:rStyle w:val="Hyperlink"/>
                 <w:noProof/>
+                <w:lang w:val="en-IN"/>
               </w:rPr>
-              <w:t xml:space="preserve"> Sort an array of 0s, 1s and 2s</w:t>
+              <w:t xml:space="preserve"> Next Permutation</w:t>
             </w:r>
             <w:r>
               <w:rPr>
@@ -489,7 +351,7 @@
                 <w:noProof/>
                 <w:webHidden/>
               </w:rPr>
-              <w:instrText xml:space="preserve"> PAGEREF _Toc125491507 \h </w:instrText>
+              <w:instrText xml:space="preserve"> PAGEREF _Toc224137436 \h </w:instrText>
             </w:r>
             <w:r>
               <w:rPr>
@@ -529,23 +391,27 @@
             <w:rPr>
               <w:rFonts w:asciiTheme="minorHAnsi" w:eastAsiaTheme="minorEastAsia" w:hAnsiTheme="minorHAnsi" w:cstheme="minorBidi"/>
               <w:noProof/>
+              <w:kern w:val="2"/>
+              <w:sz w:val="24"/>
+              <w:szCs w:val="24"/>
+              <w14:ligatures w14:val="standardContextual"/>
             </w:rPr>
           </w:pPr>
-          <w:hyperlink w:anchor="_Toc125491508" w:history="1">
+          <w:hyperlink w:anchor="_Toc224137437" w:history="1">
             <w:r>
               <w:rPr>
                 <w:rStyle w:val="Hyperlink"/>
                 <w:rFonts w:ascii="Ubuntu" w:hAnsi="Ubuntu"/>
                 <w:noProof/>
               </w:rPr>
-              <w:t>1.6</w:t>
+              <w:t>1.4</w:t>
             </w:r>
             <w:r>
               <w:rPr>
                 <w:rStyle w:val="Hyperlink"/>
                 <w:noProof/>
               </w:rPr>
-              <w:t xml:space="preserve"> Stock Buy And Sell</w:t>
+              <w:t xml:space="preserve"> Kadane’s Algorithm</w:t>
             </w:r>
             <w:r>
               <w:rPr>
@@ -566,84 +432,7 @@
                 <w:noProof/>
                 <w:webHidden/>
               </w:rPr>
-              <w:instrText xml:space="preserve"> PAGEREF _Toc125491508 \h </w:instrText>
-            </w:r>
-            <w:r>
-              <w:rPr>
-                <w:noProof/>
-                <w:webHidden/>
-              </w:rPr>
-            </w:r>
-            <w:r>
-              <w:rPr>
-                <w:noProof/>
-                <w:webHidden/>
-              </w:rPr>
-              <w:fldChar w:fldCharType="separate"/>
-            </w:r>
-            <w:r>
-              <w:rPr>
-                <w:noProof/>
-                <w:webHidden/>
-              </w:rPr>
-              <w:t>7</w:t>
-            </w:r>
-            <w:r>
-              <w:rPr>
-                <w:noProof/>
-                <w:webHidden/>
-              </w:rPr>
-              <w:fldChar w:fldCharType="end"/>
-            </w:r>
-          </w:hyperlink>
-        </w:p>
-        <w:p>
-          <w:pPr>
-            <w:pStyle w:val="TOC2"/>
-            <w:tabs>
-              <w:tab w:val="right" w:leader="dot" w:pos="9350"/>
-            </w:tabs>
-            <w:rPr>
-              <w:rFonts w:asciiTheme="minorHAnsi" w:eastAsiaTheme="minorEastAsia" w:hAnsiTheme="minorHAnsi" w:cstheme="minorBidi"/>
-              <w:noProof/>
-            </w:rPr>
-          </w:pPr>
-          <w:hyperlink w:anchor="_Toc125491509" w:history="1">
-            <w:r>
-              <w:rPr>
-                <w:rStyle w:val="Hyperlink"/>
-                <w:rFonts w:ascii="Ubuntu" w:hAnsi="Ubuntu"/>
-                <w:noProof/>
-              </w:rPr>
-              <w:t>2</w:t>
-            </w:r>
-            <w:r>
-              <w:rPr>
-                <w:rStyle w:val="Hyperlink"/>
-                <w:noProof/>
-              </w:rPr>
-              <w:t xml:space="preserve"> Arrays II</w:t>
-            </w:r>
-            <w:r>
-              <w:rPr>
-                <w:noProof/>
-                <w:webHidden/>
-              </w:rPr>
-              <w:tab/>
-            </w:r>
-            <w:r>
-              <w:rPr>
-                <w:noProof/>
-                <w:webHidden/>
-              </w:rPr>
-              <w:fldChar w:fldCharType="begin"/>
-            </w:r>
-            <w:r>
-              <w:rPr>
-                <w:noProof/>
-                <w:webHidden/>
-              </w:rPr>
-              <w:instrText xml:space="preserve"> PAGEREF _Toc125491509 \h </w:instrText>
+              <w:instrText xml:space="preserve"> PAGEREF _Toc224137437 \h </w:instrText>
             </w:r>
             <w:r>
               <w:rPr>
@@ -683,25 +472,27 @@
             <w:rPr>
               <w:rFonts w:asciiTheme="minorHAnsi" w:eastAsiaTheme="minorEastAsia" w:hAnsiTheme="minorHAnsi" w:cstheme="minorBidi"/>
               <w:noProof/>
+              <w:kern w:val="2"/>
+              <w:sz w:val="24"/>
+              <w:szCs w:val="24"/>
+              <w14:ligatures w14:val="standardContextual"/>
             </w:rPr>
           </w:pPr>
-          <w:hyperlink w:anchor="_Toc125491510" w:history="1">
+          <w:hyperlink w:anchor="_Toc224137438" w:history="1">
             <w:r>
               <w:rPr>
                 <w:rStyle w:val="Hyperlink"/>
                 <w:rFonts w:ascii="Ubuntu" w:hAnsi="Ubuntu"/>
                 <w:noProof/>
-                <w:lang w:val="en-IN"/>
               </w:rPr>
-              <w:t>2.1</w:t>
+              <w:t>1.5</w:t>
             </w:r>
             <w:r>
               <w:rPr>
                 <w:rStyle w:val="Hyperlink"/>
                 <w:noProof/>
-                <w:lang w:val="en-IN"/>
               </w:rPr>
-              <w:t xml:space="preserve"> Rotate Image by 90 degrees</w:t>
+              <w:t xml:space="preserve"> Sort an array of 0s, 1s and 2s</w:t>
             </w:r>
             <w:r>
               <w:rPr>
@@ -722,7 +513,7 @@
                 <w:noProof/>
                 <w:webHidden/>
               </w:rPr>
-              <w:instrText xml:space="preserve"> PAGEREF _Toc125491510 \h </w:instrText>
+              <w:instrText xml:space="preserve"> PAGEREF _Toc224137438 \h </w:instrText>
             </w:r>
             <w:r>
               <w:rPr>
@@ -742,7 +533,7 @@
                 <w:noProof/>
                 <w:webHidden/>
               </w:rPr>
-              <w:t>7</w:t>
+              <w:t>9</w:t>
             </w:r>
             <w:r>
               <w:rPr>
@@ -762,25 +553,27 @@
             <w:rPr>
               <w:rFonts w:asciiTheme="minorHAnsi" w:eastAsiaTheme="minorEastAsia" w:hAnsiTheme="minorHAnsi" w:cstheme="minorBidi"/>
               <w:noProof/>
+              <w:kern w:val="2"/>
+              <w:sz w:val="24"/>
+              <w:szCs w:val="24"/>
+              <w14:ligatures w14:val="standardContextual"/>
             </w:rPr>
           </w:pPr>
-          <w:hyperlink w:anchor="_Toc125491511" w:history="1">
+          <w:hyperlink w:anchor="_Toc224137439" w:history="1">
             <w:r>
               <w:rPr>
                 <w:rStyle w:val="Hyperlink"/>
                 <w:rFonts w:ascii="Ubuntu" w:hAnsi="Ubuntu"/>
                 <w:noProof/>
-                <w:lang w:val="en-IN"/>
               </w:rPr>
-              <w:t>2.2</w:t>
+              <w:t>1.6</w:t>
             </w:r>
             <w:r>
               <w:rPr>
                 <w:rStyle w:val="Hyperlink"/>
                 <w:noProof/>
-                <w:lang w:val="en-IN"/>
               </w:rPr>
-              <w:t xml:space="preserve"> Merge Overlapping Sub-intervals</w:t>
+              <w:t xml:space="preserve"> Stock Buy And Sell</w:t>
             </w:r>
             <w:r>
               <w:rPr>
@@ -801,165 +594,7 @@
                 <w:noProof/>
                 <w:webHidden/>
               </w:rPr>
-              <w:instrText xml:space="preserve"> PAGEREF _Toc125491511 \h </w:instrText>
-            </w:r>
-            <w:r>
-              <w:rPr>
-                <w:noProof/>
-                <w:webHidden/>
-              </w:rPr>
-            </w:r>
-            <w:r>
-              <w:rPr>
-                <w:noProof/>
-                <w:webHidden/>
-              </w:rPr>
-              <w:fldChar w:fldCharType="separate"/>
-            </w:r>
-            <w:r>
-              <w:rPr>
-                <w:noProof/>
-                <w:webHidden/>
-              </w:rPr>
-              <w:t>8</w:t>
-            </w:r>
-            <w:r>
-              <w:rPr>
-                <w:noProof/>
-                <w:webHidden/>
-              </w:rPr>
-              <w:fldChar w:fldCharType="end"/>
-            </w:r>
-          </w:hyperlink>
-        </w:p>
-        <w:p>
-          <w:pPr>
-            <w:pStyle w:val="TOC3"/>
-            <w:tabs>
-              <w:tab w:val="right" w:leader="dot" w:pos="9350"/>
-            </w:tabs>
-            <w:rPr>
-              <w:rFonts w:asciiTheme="minorHAnsi" w:eastAsiaTheme="minorEastAsia" w:hAnsiTheme="minorHAnsi" w:cstheme="minorBidi"/>
-              <w:noProof/>
-            </w:rPr>
-          </w:pPr>
-          <w:hyperlink w:anchor="_Toc125491512" w:history="1">
-            <w:r>
-              <w:rPr>
-                <w:rStyle w:val="Hyperlink"/>
-                <w:rFonts w:ascii="Ubuntu" w:hAnsi="Ubuntu"/>
-                <w:noProof/>
-                <w:lang w:val="en-IN"/>
-              </w:rPr>
-              <w:t>2.3</w:t>
-            </w:r>
-            <w:r>
-              <w:rPr>
-                <w:rStyle w:val="Hyperlink"/>
-                <w:noProof/>
-                <w:lang w:val="en-IN"/>
-              </w:rPr>
-              <w:t xml:space="preserve"> Find the duplicate in an array of N+1 integers</w:t>
-            </w:r>
-            <w:r>
-              <w:rPr>
-                <w:noProof/>
-                <w:webHidden/>
-              </w:rPr>
-              <w:tab/>
-            </w:r>
-            <w:r>
-              <w:rPr>
-                <w:noProof/>
-                <w:webHidden/>
-              </w:rPr>
-              <w:fldChar w:fldCharType="begin"/>
-            </w:r>
-            <w:r>
-              <w:rPr>
-                <w:noProof/>
-                <w:webHidden/>
-              </w:rPr>
-              <w:instrText xml:space="preserve"> PAGEREF _Toc125491512 \h </w:instrText>
-            </w:r>
-            <w:r>
-              <w:rPr>
-                <w:noProof/>
-                <w:webHidden/>
-              </w:rPr>
-            </w:r>
-            <w:r>
-              <w:rPr>
-                <w:noProof/>
-                <w:webHidden/>
-              </w:rPr>
-              <w:fldChar w:fldCharType="separate"/>
-            </w:r>
-            <w:r>
-              <w:rPr>
-                <w:noProof/>
-                <w:webHidden/>
-              </w:rPr>
-              <w:t>8</w:t>
-            </w:r>
-            <w:r>
-              <w:rPr>
-                <w:noProof/>
-                <w:webHidden/>
-              </w:rPr>
-              <w:fldChar w:fldCharType="end"/>
-            </w:r>
-          </w:hyperlink>
-        </w:p>
-        <w:p>
-          <w:pPr>
-            <w:pStyle w:val="TOC3"/>
-            <w:tabs>
-              <w:tab w:val="right" w:leader="dot" w:pos="9350"/>
-            </w:tabs>
-            <w:rPr>
-              <w:rFonts w:asciiTheme="minorHAnsi" w:eastAsiaTheme="minorEastAsia" w:hAnsiTheme="minorHAnsi" w:cstheme="minorBidi"/>
-              <w:noProof/>
-            </w:rPr>
-          </w:pPr>
-          <w:hyperlink w:anchor="_Toc125491513" w:history="1">
-            <w:r>
-              <w:rPr>
-                <w:rStyle w:val="Hyperlink"/>
-                <w:rFonts w:ascii="Ubuntu" w:hAnsi="Ubuntu"/>
-                <w:noProof/>
-                <w:lang w:val="en-IN"/>
-              </w:rPr>
-              <w:t>2.4</w:t>
-            </w:r>
-            <w:r>
-              <w:rPr>
-                <w:rStyle w:val="Hyperlink"/>
-                <w:noProof/>
-                <w:lang w:val="en-IN"/>
-              </w:rPr>
-              <w:t xml:space="preserve"> Merge two Sorted Arrays Without Extra Space</w:t>
-            </w:r>
-            <w:r>
-              <w:rPr>
-                <w:noProof/>
-                <w:webHidden/>
-              </w:rPr>
-              <w:tab/>
-            </w:r>
-            <w:r>
-              <w:rPr>
-                <w:noProof/>
-                <w:webHidden/>
-              </w:rPr>
-              <w:fldChar w:fldCharType="begin"/>
-            </w:r>
-            <w:r>
-              <w:rPr>
-                <w:noProof/>
-                <w:webHidden/>
-              </w:rPr>
-              <w:instrText xml:space="preserve"> PAGEREF _Toc125491513 \h </w:instrText>
+              <w:instrText xml:space="preserve"> PAGEREF _Toc224137439 \h </w:instrText>
             </w:r>
             <w:r>
               <w:rPr>
@@ -992,32 +627,34 @@
         </w:p>
         <w:p>
           <w:pPr>
-            <w:pStyle w:val="TOC3"/>
+            <w:pStyle w:val="TOC2"/>
             <w:tabs>
               <w:tab w:val="right" w:leader="dot" w:pos="9350"/>
             </w:tabs>
             <w:rPr>
               <w:rFonts w:asciiTheme="minorHAnsi" w:eastAsiaTheme="minorEastAsia" w:hAnsiTheme="minorHAnsi" w:cstheme="minorBidi"/>
               <w:noProof/>
+              <w:kern w:val="2"/>
+              <w:sz w:val="24"/>
+              <w:szCs w:val="24"/>
+              <w14:ligatures w14:val="standardContextual"/>
             </w:rPr>
           </w:pPr>
-          <w:hyperlink w:anchor="_Toc125491514" w:history="1">
+          <w:hyperlink w:anchor="_Toc224137440" w:history="1">
             <w:r>
               <w:rPr>
                 <w:rStyle w:val="Hyperlink"/>
                 <w:rFonts w:ascii="Ubuntu" w:hAnsi="Ubuntu"/>
                 <w:noProof/>
-                <w:lang w:val="en-IN"/>
               </w:rPr>
-              <w:t>2.5</w:t>
+              <w:t>2</w:t>
             </w:r>
             <w:r>
               <w:rPr>
                 <w:rStyle w:val="Hyperlink"/>
                 <w:noProof/>
-                <w:lang w:val="en-IN"/>
               </w:rPr>
-              <w:t xml:space="preserve"> Repeating and Missing numbers</w:t>
+              <w:t xml:space="preserve"> Arrays II</w:t>
             </w:r>
             <w:r>
               <w:rPr>
@@ -1038,7 +675,7 @@
                 <w:noProof/>
                 <w:webHidden/>
               </w:rPr>
-              <w:instrText xml:space="preserve"> PAGEREF _Toc125491514 \h </w:instrText>
+              <w:instrText xml:space="preserve"> PAGEREF _Toc224137440 \h </w:instrText>
             </w:r>
             <w:r>
               <w:rPr>
@@ -1078,9 +715,13 @@
             <w:rPr>
               <w:rFonts w:asciiTheme="minorHAnsi" w:eastAsiaTheme="minorEastAsia" w:hAnsiTheme="minorHAnsi" w:cstheme="minorBidi"/>
               <w:noProof/>
+              <w:kern w:val="2"/>
+              <w:sz w:val="24"/>
+              <w:szCs w:val="24"/>
+              <w14:ligatures w14:val="standardContextual"/>
             </w:rPr>
           </w:pPr>
-          <w:hyperlink w:anchor="_Toc125491515" w:history="1">
+          <w:hyperlink w:anchor="_Toc224137441" w:history="1">
             <w:r>
               <w:rPr>
                 <w:rStyle w:val="Hyperlink"/>
@@ -1088,7 +729,7 @@
                 <w:noProof/>
                 <w:lang w:val="en-IN"/>
               </w:rPr>
-              <w:t>2.6</w:t>
+              <w:t>2.1</w:t>
             </w:r>
             <w:r>
               <w:rPr>
@@ -1096,7 +737,7 @@
                 <w:noProof/>
                 <w:lang w:val="en-IN"/>
               </w:rPr>
-              <w:t xml:space="preserve"> Count inversions in an array</w:t>
+              <w:t xml:space="preserve"> Rotate Image by 90 degrees</w:t>
             </w:r>
             <w:r>
               <w:rPr>
@@ -1117,7 +758,173 @@
                 <w:noProof/>
                 <w:webHidden/>
               </w:rPr>
-              <w:instrText xml:space="preserve"> PAGEREF _Toc125491515 \h </w:instrText>
+              <w:instrText xml:space="preserve"> PAGEREF _Toc224137441 \h </w:instrText>
+            </w:r>
+            <w:r>
+              <w:rPr>
+                <w:noProof/>
+                <w:webHidden/>
+              </w:rPr>
+            </w:r>
+            <w:r>
+              <w:rPr>
+                <w:noProof/>
+                <w:webHidden/>
+              </w:rPr>
+              <w:fldChar w:fldCharType="separate"/>
+            </w:r>
+            <w:r>
+              <w:rPr>
+                <w:noProof/>
+                <w:webHidden/>
+              </w:rPr>
+              <w:t>11</w:t>
+            </w:r>
+            <w:r>
+              <w:rPr>
+                <w:noProof/>
+                <w:webHidden/>
+              </w:rPr>
+              <w:fldChar w:fldCharType="end"/>
+            </w:r>
+          </w:hyperlink>
+        </w:p>
+        <w:p>
+          <w:pPr>
+            <w:pStyle w:val="TOC3"/>
+            <w:tabs>
+              <w:tab w:val="right" w:leader="dot" w:pos="9350"/>
+            </w:tabs>
+            <w:rPr>
+              <w:rFonts w:asciiTheme="minorHAnsi" w:eastAsiaTheme="minorEastAsia" w:hAnsiTheme="minorHAnsi" w:cstheme="minorBidi"/>
+              <w:noProof/>
+              <w:kern w:val="2"/>
+              <w:sz w:val="24"/>
+              <w:szCs w:val="24"/>
+              <w14:ligatures w14:val="standardContextual"/>
+            </w:rPr>
+          </w:pPr>
+          <w:hyperlink w:anchor="_Toc224137442" w:history="1">
+            <w:r>
+              <w:rPr>
+                <w:rStyle w:val="Hyperlink"/>
+                <w:rFonts w:ascii="Ubuntu" w:hAnsi="Ubuntu"/>
+                <w:noProof/>
+                <w:lang w:val="en-IN"/>
+              </w:rPr>
+              <w:t>2.2</w:t>
+            </w:r>
+            <w:r>
+              <w:rPr>
+                <w:rStyle w:val="Hyperlink"/>
+                <w:noProof/>
+                <w:lang w:val="en-IN"/>
+              </w:rPr>
+              <w:t xml:space="preserve"> Merge Overlapping Sub-intervals</w:t>
+            </w:r>
+            <w:r>
+              <w:rPr>
+                <w:noProof/>
+                <w:webHidden/>
+              </w:rPr>
+              <w:tab/>
+            </w:r>
+            <w:r>
+              <w:rPr>
+                <w:noProof/>
+                <w:webHidden/>
+              </w:rPr>
+              <w:fldChar w:fldCharType="begin"/>
+            </w:r>
+            <w:r>
+              <w:rPr>
+                <w:noProof/>
+                <w:webHidden/>
+              </w:rPr>
+              <w:instrText xml:space="preserve"> PAGEREF _Toc224137442 \h </w:instrText>
+            </w:r>
+            <w:r>
+              <w:rPr>
+                <w:noProof/>
+                <w:webHidden/>
+              </w:rPr>
+            </w:r>
+            <w:r>
+              <w:rPr>
+                <w:noProof/>
+                <w:webHidden/>
+              </w:rPr>
+              <w:fldChar w:fldCharType="separate"/>
+            </w:r>
+            <w:r>
+              <w:rPr>
+                <w:noProof/>
+                <w:webHidden/>
+              </w:rPr>
+              <w:t>11</w:t>
+            </w:r>
+            <w:r>
+              <w:rPr>
+                <w:noProof/>
+                <w:webHidden/>
+              </w:rPr>
+              <w:fldChar w:fldCharType="end"/>
+            </w:r>
+          </w:hyperlink>
+        </w:p>
+        <w:p>
+          <w:pPr>
+            <w:pStyle w:val="TOC3"/>
+            <w:tabs>
+              <w:tab w:val="right" w:leader="dot" w:pos="9350"/>
+            </w:tabs>
+            <w:rPr>
+              <w:rFonts w:asciiTheme="minorHAnsi" w:eastAsiaTheme="minorEastAsia" w:hAnsiTheme="minorHAnsi" w:cstheme="minorBidi"/>
+              <w:noProof/>
+              <w:kern w:val="2"/>
+              <w:sz w:val="24"/>
+              <w:szCs w:val="24"/>
+              <w14:ligatures w14:val="standardContextual"/>
+            </w:rPr>
+          </w:pPr>
+          <w:hyperlink w:anchor="_Toc224137443" w:history="1">
+            <w:r>
+              <w:rPr>
+                <w:rStyle w:val="Hyperlink"/>
+                <w:rFonts w:ascii="Ubuntu" w:hAnsi="Ubuntu"/>
+                <w:noProof/>
+                <w:lang w:val="en-IN"/>
+              </w:rPr>
+              <w:t>2.3</w:t>
+            </w:r>
+            <w:r>
+              <w:rPr>
+                <w:rStyle w:val="Hyperlink"/>
+                <w:noProof/>
+                <w:lang w:val="en-IN"/>
+              </w:rPr>
+              <w:t xml:space="preserve"> Find the duplicate in an array of N+1 integers</w:t>
+            </w:r>
+            <w:r>
+              <w:rPr>
+                <w:noProof/>
+                <w:webHidden/>
+              </w:rPr>
+              <w:tab/>
+            </w:r>
+            <w:r>
+              <w:rPr>
+                <w:noProof/>
+                <w:webHidden/>
+              </w:rPr>
+              <w:fldChar w:fldCharType="begin"/>
+            </w:r>
+            <w:r>
+              <w:rPr>
+                <w:noProof/>
+                <w:webHidden/>
+              </w:rPr>
+              <w:instrText xml:space="preserve"> PAGEREF _Toc224137443 \h </w:instrText>
             </w:r>
             <w:r>
               <w:rPr>
@@ -1150,30 +957,36 @@
         </w:p>
         <w:p>
           <w:pPr>
-            <w:pStyle w:val="TOC2"/>
+            <w:pStyle w:val="TOC3"/>
             <w:tabs>
               <w:tab w:val="right" w:leader="dot" w:pos="9350"/>
             </w:tabs>
             <w:rPr>
               <w:rFonts w:asciiTheme="minorHAnsi" w:eastAsiaTheme="minorEastAsia" w:hAnsiTheme="minorHAnsi" w:cstheme="minorBidi"/>
               <w:noProof/>
+              <w:kern w:val="2"/>
+              <w:sz w:val="24"/>
+              <w:szCs w:val="24"/>
+              <w14:ligatures w14:val="standardContextual"/>
             </w:rPr>
           </w:pPr>
-          <w:hyperlink w:anchor="_Toc125491516" w:history="1">
+          <w:hyperlink w:anchor="_Toc224137444" w:history="1">
             <w:r>
               <w:rPr>
                 <w:rStyle w:val="Hyperlink"/>
                 <w:rFonts w:ascii="Ubuntu" w:hAnsi="Ubuntu"/>
                 <w:noProof/>
+                <w:lang w:val="en-IN"/>
               </w:rPr>
-              <w:t>3</w:t>
+              <w:t>2.4</w:t>
             </w:r>
             <w:r>
               <w:rPr>
                 <w:rStyle w:val="Hyperlink"/>
                 <w:noProof/>
+                <w:lang w:val="en-IN"/>
               </w:rPr>
-              <w:t xml:space="preserve"> Arrays III</w:t>
+              <w:t xml:space="preserve"> Merge two Sorted Arrays Without Extra Space</w:t>
             </w:r>
             <w:r>
               <w:rPr>
@@ -1194,556 +1007,7 @@
                 <w:noProof/>
                 <w:webHidden/>
               </w:rPr>
-              <w:instrText xml:space="preserve"> PAGEREF _Toc125491516 \h </w:instrText>
-            </w:r>
-            <w:r>
-              <w:rPr>
-                <w:noProof/>
-                <w:webHidden/>
-              </w:rPr>
-            </w:r>
-            <w:r>
-              <w:rPr>
-                <w:noProof/>
-                <w:webHidden/>
-              </w:rPr>
-              <w:fldChar w:fldCharType="separate"/>
-            </w:r>
-            <w:r>
-              <w:rPr>
-                <w:noProof/>
-                <w:webHidden/>
-              </w:rPr>
-              <w:t>13</w:t>
-            </w:r>
-            <w:r>
-              <w:rPr>
-                <w:noProof/>
-                <w:webHidden/>
-              </w:rPr>
-              <w:fldChar w:fldCharType="end"/>
-            </w:r>
-          </w:hyperlink>
-        </w:p>
-        <w:p>
-          <w:pPr>
-            <w:pStyle w:val="TOC3"/>
-            <w:tabs>
-              <w:tab w:val="right" w:leader="dot" w:pos="9350"/>
-            </w:tabs>
-            <w:rPr>
-              <w:rFonts w:asciiTheme="minorHAnsi" w:eastAsiaTheme="minorEastAsia" w:hAnsiTheme="minorHAnsi" w:cstheme="minorBidi"/>
-              <w:noProof/>
-            </w:rPr>
-          </w:pPr>
-          <w:hyperlink w:anchor="_Toc125491517" w:history="1">
-            <w:r>
-              <w:rPr>
-                <w:rStyle w:val="Hyperlink"/>
-                <w:rFonts w:ascii="Ubuntu" w:hAnsi="Ubuntu"/>
-                <w:noProof/>
-              </w:rPr>
-              <w:t>3.1</w:t>
-            </w:r>
-            <w:r>
-              <w:rPr>
-                <w:rStyle w:val="Hyperlink"/>
-                <w:noProof/>
-              </w:rPr>
-              <w:t xml:space="preserve"> Search in a sorted 2D matrix</w:t>
-            </w:r>
-            <w:r>
-              <w:rPr>
-                <w:noProof/>
-                <w:webHidden/>
-              </w:rPr>
-              <w:tab/>
-            </w:r>
-            <w:r>
-              <w:rPr>
-                <w:noProof/>
-                <w:webHidden/>
-              </w:rPr>
-              <w:fldChar w:fldCharType="begin"/>
-            </w:r>
-            <w:r>
-              <w:rPr>
-                <w:noProof/>
-                <w:webHidden/>
-              </w:rPr>
-              <w:instrText xml:space="preserve"> PAGEREF _Toc125491517 \h </w:instrText>
-            </w:r>
-            <w:r>
-              <w:rPr>
-                <w:noProof/>
-                <w:webHidden/>
-              </w:rPr>
-            </w:r>
-            <w:r>
-              <w:rPr>
-                <w:noProof/>
-                <w:webHidden/>
-              </w:rPr>
-              <w:fldChar w:fldCharType="separate"/>
-            </w:r>
-            <w:r>
-              <w:rPr>
-                <w:noProof/>
-                <w:webHidden/>
-              </w:rPr>
-              <w:t>13</w:t>
-            </w:r>
-            <w:r>
-              <w:rPr>
-                <w:noProof/>
-                <w:webHidden/>
-              </w:rPr>
-              <w:fldChar w:fldCharType="end"/>
-            </w:r>
-          </w:hyperlink>
-        </w:p>
-        <w:p>
-          <w:pPr>
-            <w:pStyle w:val="TOC3"/>
-            <w:tabs>
-              <w:tab w:val="right" w:leader="dot" w:pos="9350"/>
-            </w:tabs>
-            <w:rPr>
-              <w:rFonts w:asciiTheme="minorHAnsi" w:eastAsiaTheme="minorEastAsia" w:hAnsiTheme="minorHAnsi" w:cstheme="minorBidi"/>
-              <w:noProof/>
-            </w:rPr>
-          </w:pPr>
-          <w:hyperlink w:anchor="_Toc125491518" w:history="1">
-            <w:r>
-              <w:rPr>
-                <w:rStyle w:val="Hyperlink"/>
-                <w:rFonts w:ascii="Ubuntu" w:hAnsi="Ubuntu"/>
-                <w:noProof/>
-                <w:lang w:val="en-IN"/>
-              </w:rPr>
-              <w:t>3.2</w:t>
-            </w:r>
-            <w:r>
-              <w:rPr>
-                <w:rStyle w:val="Hyperlink"/>
-                <w:noProof/>
-                <w:lang w:val="en-IN"/>
-              </w:rPr>
-              <w:t xml:space="preserve"> Implement Pow(x,n) | X raised to the power N</w:t>
-            </w:r>
-            <w:r>
-              <w:rPr>
-                <w:noProof/>
-                <w:webHidden/>
-              </w:rPr>
-              <w:tab/>
-            </w:r>
-            <w:r>
-              <w:rPr>
-                <w:noProof/>
-                <w:webHidden/>
-              </w:rPr>
-              <w:fldChar w:fldCharType="begin"/>
-            </w:r>
-            <w:r>
-              <w:rPr>
-                <w:noProof/>
-                <w:webHidden/>
-              </w:rPr>
-              <w:instrText xml:space="preserve"> PAGEREF _Toc125491518 \h </w:instrText>
-            </w:r>
-            <w:r>
-              <w:rPr>
-                <w:noProof/>
-                <w:webHidden/>
-              </w:rPr>
-            </w:r>
-            <w:r>
-              <w:rPr>
-                <w:noProof/>
-                <w:webHidden/>
-              </w:rPr>
-              <w:fldChar w:fldCharType="separate"/>
-            </w:r>
-            <w:r>
-              <w:rPr>
-                <w:noProof/>
-                <w:webHidden/>
-              </w:rPr>
-              <w:t>15</w:t>
-            </w:r>
-            <w:r>
-              <w:rPr>
-                <w:noProof/>
-                <w:webHidden/>
-              </w:rPr>
-              <w:fldChar w:fldCharType="end"/>
-            </w:r>
-          </w:hyperlink>
-        </w:p>
-        <w:p>
-          <w:pPr>
-            <w:pStyle w:val="TOC3"/>
-            <w:tabs>
-              <w:tab w:val="right" w:leader="dot" w:pos="9350"/>
-            </w:tabs>
-            <w:rPr>
-              <w:rFonts w:asciiTheme="minorHAnsi" w:eastAsiaTheme="minorEastAsia" w:hAnsiTheme="minorHAnsi" w:cstheme="minorBidi"/>
-              <w:noProof/>
-            </w:rPr>
-          </w:pPr>
-          <w:hyperlink w:anchor="_Toc125491519" w:history="1">
-            <w:r>
-              <w:rPr>
-                <w:rStyle w:val="Hyperlink"/>
-                <w:rFonts w:ascii="Ubuntu" w:hAnsi="Ubuntu"/>
-                <w:noProof/>
-                <w:lang w:val="en-IN"/>
-              </w:rPr>
-              <w:t>3.3</w:t>
-            </w:r>
-            <w:r>
-              <w:rPr>
-                <w:rStyle w:val="Hyperlink"/>
-                <w:noProof/>
-                <w:lang w:val="en-IN"/>
-              </w:rPr>
-              <w:t xml:space="preserve"> Find the Majority Element that occurs more than N/2 times</w:t>
-            </w:r>
-            <w:r>
-              <w:rPr>
-                <w:noProof/>
-                <w:webHidden/>
-              </w:rPr>
-              <w:tab/>
-            </w:r>
-            <w:r>
-              <w:rPr>
-                <w:noProof/>
-                <w:webHidden/>
-              </w:rPr>
-              <w:fldChar w:fldCharType="begin"/>
-            </w:r>
-            <w:r>
-              <w:rPr>
-                <w:noProof/>
-                <w:webHidden/>
-              </w:rPr>
-              <w:instrText xml:space="preserve"> PAGEREF _Toc125491519 \h </w:instrText>
-            </w:r>
-            <w:r>
-              <w:rPr>
-                <w:noProof/>
-                <w:webHidden/>
-              </w:rPr>
-            </w:r>
-            <w:r>
-              <w:rPr>
-                <w:noProof/>
-                <w:webHidden/>
-              </w:rPr>
-              <w:fldChar w:fldCharType="separate"/>
-            </w:r>
-            <w:r>
-              <w:rPr>
-                <w:noProof/>
-                <w:webHidden/>
-              </w:rPr>
-              <w:t>15</w:t>
-            </w:r>
-            <w:r>
-              <w:rPr>
-                <w:noProof/>
-                <w:webHidden/>
-              </w:rPr>
-              <w:fldChar w:fldCharType="end"/>
-            </w:r>
-          </w:hyperlink>
-        </w:p>
-        <w:p>
-          <w:pPr>
-            <w:pStyle w:val="TOC3"/>
-            <w:tabs>
-              <w:tab w:val="right" w:leader="dot" w:pos="9350"/>
-            </w:tabs>
-            <w:rPr>
-              <w:rFonts w:asciiTheme="minorHAnsi" w:eastAsiaTheme="minorEastAsia" w:hAnsiTheme="minorHAnsi" w:cstheme="minorBidi"/>
-              <w:noProof/>
-            </w:rPr>
-          </w:pPr>
-          <w:hyperlink w:anchor="_Toc125491520" w:history="1">
-            <w:r>
-              <w:rPr>
-                <w:rStyle w:val="Hyperlink"/>
-                <w:rFonts w:ascii="Ubuntu" w:hAnsi="Ubuntu"/>
-                <w:noProof/>
-                <w:lang w:val="en-IN"/>
-              </w:rPr>
-              <w:t>3.4</w:t>
-            </w:r>
-            <w:r>
-              <w:rPr>
-                <w:rStyle w:val="Hyperlink"/>
-                <w:noProof/>
-                <w:lang w:val="en-IN"/>
-              </w:rPr>
-              <w:t xml:space="preserve"> Majority Elements(&gt;N/3 times)</w:t>
-            </w:r>
-            <w:r>
-              <w:rPr>
-                <w:noProof/>
-                <w:webHidden/>
-              </w:rPr>
-              <w:tab/>
-            </w:r>
-            <w:r>
-              <w:rPr>
-                <w:noProof/>
-                <w:webHidden/>
-              </w:rPr>
-              <w:fldChar w:fldCharType="begin"/>
-            </w:r>
-            <w:r>
-              <w:rPr>
-                <w:noProof/>
-                <w:webHidden/>
-              </w:rPr>
-              <w:instrText xml:space="preserve"> PAGEREF _Toc125491520 \h </w:instrText>
-            </w:r>
-            <w:r>
-              <w:rPr>
-                <w:noProof/>
-                <w:webHidden/>
-              </w:rPr>
-            </w:r>
-            <w:r>
-              <w:rPr>
-                <w:noProof/>
-                <w:webHidden/>
-              </w:rPr>
-              <w:fldChar w:fldCharType="separate"/>
-            </w:r>
-            <w:r>
-              <w:rPr>
-                <w:noProof/>
-                <w:webHidden/>
-              </w:rPr>
-              <w:t>15</w:t>
-            </w:r>
-            <w:r>
-              <w:rPr>
-                <w:noProof/>
-                <w:webHidden/>
-              </w:rPr>
-              <w:fldChar w:fldCharType="end"/>
-            </w:r>
-          </w:hyperlink>
-        </w:p>
-        <w:p>
-          <w:pPr>
-            <w:pStyle w:val="TOC3"/>
-            <w:tabs>
-              <w:tab w:val="right" w:leader="dot" w:pos="9350"/>
-            </w:tabs>
-            <w:rPr>
-              <w:rFonts w:asciiTheme="minorHAnsi" w:eastAsiaTheme="minorEastAsia" w:hAnsiTheme="minorHAnsi" w:cstheme="minorBidi"/>
-              <w:noProof/>
-            </w:rPr>
-          </w:pPr>
-          <w:hyperlink w:anchor="_Toc125491521" w:history="1">
-            <w:r>
-              <w:rPr>
-                <w:rStyle w:val="Hyperlink"/>
-                <w:rFonts w:ascii="Ubuntu" w:hAnsi="Ubuntu"/>
-                <w:noProof/>
-                <w:lang w:val="en-IN"/>
-              </w:rPr>
-              <w:t>3.5</w:t>
-            </w:r>
-            <w:r>
-              <w:rPr>
-                <w:rStyle w:val="Hyperlink"/>
-                <w:noProof/>
-                <w:lang w:val="en-IN"/>
-              </w:rPr>
-              <w:t xml:space="preserve"> Grid Unique Paths</w:t>
-            </w:r>
-            <w:r>
-              <w:rPr>
-                <w:noProof/>
-                <w:webHidden/>
-              </w:rPr>
-              <w:tab/>
-            </w:r>
-            <w:r>
-              <w:rPr>
-                <w:noProof/>
-                <w:webHidden/>
-              </w:rPr>
-              <w:fldChar w:fldCharType="begin"/>
-            </w:r>
-            <w:r>
-              <w:rPr>
-                <w:noProof/>
-                <w:webHidden/>
-              </w:rPr>
-              <w:instrText xml:space="preserve"> PAGEREF _Toc125491521 \h </w:instrText>
-            </w:r>
-            <w:r>
-              <w:rPr>
-                <w:noProof/>
-                <w:webHidden/>
-              </w:rPr>
-            </w:r>
-            <w:r>
-              <w:rPr>
-                <w:noProof/>
-                <w:webHidden/>
-              </w:rPr>
-              <w:fldChar w:fldCharType="separate"/>
-            </w:r>
-            <w:r>
-              <w:rPr>
-                <w:noProof/>
-                <w:webHidden/>
-              </w:rPr>
-              <w:t>16</w:t>
-            </w:r>
-            <w:r>
-              <w:rPr>
-                <w:noProof/>
-                <w:webHidden/>
-              </w:rPr>
-              <w:fldChar w:fldCharType="end"/>
-            </w:r>
-          </w:hyperlink>
-        </w:p>
-        <w:p>
-          <w:pPr>
-            <w:pStyle w:val="TOC3"/>
-            <w:tabs>
-              <w:tab w:val="right" w:leader="dot" w:pos="9350"/>
-            </w:tabs>
-            <w:rPr>
-              <w:rFonts w:asciiTheme="minorHAnsi" w:eastAsiaTheme="minorEastAsia" w:hAnsiTheme="minorHAnsi" w:cstheme="minorBidi"/>
-              <w:noProof/>
-            </w:rPr>
-          </w:pPr>
-          <w:hyperlink w:anchor="_Toc125491522" w:history="1">
-            <w:r>
-              <w:rPr>
-                <w:rStyle w:val="Hyperlink"/>
-                <w:rFonts w:ascii="Ubuntu" w:hAnsi="Ubuntu"/>
-                <w:noProof/>
-                <w:lang w:val="en-IN"/>
-              </w:rPr>
-              <w:t>3.6</w:t>
-            </w:r>
-            <w:r>
-              <w:rPr>
-                <w:rStyle w:val="Hyperlink"/>
-                <w:noProof/>
-                <w:lang w:val="en-IN"/>
-              </w:rPr>
-              <w:t xml:space="preserve"> Count Reverse Pairs</w:t>
-            </w:r>
-            <w:r>
-              <w:rPr>
-                <w:noProof/>
-                <w:webHidden/>
-              </w:rPr>
-              <w:tab/>
-            </w:r>
-            <w:r>
-              <w:rPr>
-                <w:noProof/>
-                <w:webHidden/>
-              </w:rPr>
-              <w:fldChar w:fldCharType="begin"/>
-            </w:r>
-            <w:r>
-              <w:rPr>
-                <w:noProof/>
-                <w:webHidden/>
-              </w:rPr>
-              <w:instrText xml:space="preserve"> PAGEREF _Toc125491522 \h </w:instrText>
-            </w:r>
-            <w:r>
-              <w:rPr>
-                <w:noProof/>
-                <w:webHidden/>
-              </w:rPr>
-            </w:r>
-            <w:r>
-              <w:rPr>
-                <w:noProof/>
-                <w:webHidden/>
-              </w:rPr>
-              <w:fldChar w:fldCharType="separate"/>
-            </w:r>
-            <w:r>
-              <w:rPr>
-                <w:noProof/>
-                <w:webHidden/>
-              </w:rPr>
-              <w:t>17</w:t>
-            </w:r>
-            <w:r>
-              <w:rPr>
-                <w:noProof/>
-                <w:webHidden/>
-              </w:rPr>
-              <w:fldChar w:fldCharType="end"/>
-            </w:r>
-          </w:hyperlink>
-        </w:p>
-        <w:p>
-          <w:pPr>
-            <w:pStyle w:val="TOC2"/>
-            <w:tabs>
-              <w:tab w:val="right" w:leader="dot" w:pos="9350"/>
-            </w:tabs>
-            <w:rPr>
-              <w:rFonts w:asciiTheme="minorHAnsi" w:eastAsiaTheme="minorEastAsia" w:hAnsiTheme="minorHAnsi" w:cstheme="minorBidi"/>
-              <w:noProof/>
-            </w:rPr>
-          </w:pPr>
-          <w:hyperlink w:anchor="_Toc125491523" w:history="1">
-            <w:r>
-              <w:rPr>
-                <w:rStyle w:val="Hyperlink"/>
-                <w:rFonts w:ascii="Ubuntu" w:hAnsi="Ubuntu"/>
-                <w:noProof/>
-              </w:rPr>
-              <w:t>4</w:t>
-            </w:r>
-            <w:r>
-              <w:rPr>
-                <w:rStyle w:val="Hyperlink"/>
-                <w:noProof/>
-              </w:rPr>
-              <w:t xml:space="preserve"> Arrays IV</w:t>
-            </w:r>
-            <w:r>
-              <w:rPr>
-                <w:noProof/>
-                <w:webHidden/>
-              </w:rPr>
-              <w:tab/>
-            </w:r>
-            <w:r>
-              <w:rPr>
-                <w:noProof/>
-                <w:webHidden/>
-              </w:rPr>
-              <w:fldChar w:fldCharType="begin"/>
-            </w:r>
-            <w:r>
-              <w:rPr>
-                <w:noProof/>
-                <w:webHidden/>
-              </w:rPr>
-              <w:instrText xml:space="preserve"> PAGEREF _Toc125491523 \h </w:instrText>
+              <w:instrText xml:space="preserve"> PAGEREF _Toc224137444 \h </w:instrText>
             </w:r>
             <w:r>
               <w:rPr>
@@ -1783,9 +1047,13 @@
             <w:rPr>
               <w:rFonts w:asciiTheme="minorHAnsi" w:eastAsiaTheme="minorEastAsia" w:hAnsiTheme="minorHAnsi" w:cstheme="minorBidi"/>
               <w:noProof/>
+              <w:kern w:val="2"/>
+              <w:sz w:val="24"/>
+              <w:szCs w:val="24"/>
+              <w14:ligatures w14:val="standardContextual"/>
             </w:rPr>
           </w:pPr>
-          <w:hyperlink w:anchor="_Toc125491524" w:history="1">
+          <w:hyperlink w:anchor="_Toc224137445" w:history="1">
             <w:r>
               <w:rPr>
                 <w:rStyle w:val="Hyperlink"/>
@@ -1793,7 +1061,7 @@
                 <w:noProof/>
                 <w:lang w:val="en-IN"/>
               </w:rPr>
-              <w:t>4.1</w:t>
+              <w:t>2.5</w:t>
             </w:r>
             <w:r>
               <w:rPr>
@@ -1801,7 +1069,7 @@
                 <w:noProof/>
                 <w:lang w:val="en-IN"/>
               </w:rPr>
-              <w:t xml:space="preserve"> Two Sum</w:t>
+              <w:t xml:space="preserve"> Repeating and Missing numbers</w:t>
             </w:r>
             <w:r>
               <w:rPr>
@@ -1822,84 +1090,7 @@
                 <w:noProof/>
                 <w:webHidden/>
               </w:rPr>
-              <w:instrText xml:space="preserve"> PAGEREF _Toc125491524 \h </w:instrText>
-            </w:r>
-            <w:r>
-              <w:rPr>
-                <w:noProof/>
-                <w:webHidden/>
-              </w:rPr>
-            </w:r>
-            <w:r>
-              <w:rPr>
-                <w:noProof/>
-                <w:webHidden/>
-              </w:rPr>
-              <w:fldChar w:fldCharType="separate"/>
-            </w:r>
-            <w:r>
-              <w:rPr>
-                <w:noProof/>
-                <w:webHidden/>
-              </w:rPr>
-              <w:t>17</w:t>
-            </w:r>
-            <w:r>
-              <w:rPr>
-                <w:noProof/>
-                <w:webHidden/>
-              </w:rPr>
-              <w:fldChar w:fldCharType="end"/>
-            </w:r>
-          </w:hyperlink>
-        </w:p>
-        <w:p>
-          <w:pPr>
-            <w:pStyle w:val="TOC3"/>
-            <w:tabs>
-              <w:tab w:val="right" w:leader="dot" w:pos="9350"/>
-            </w:tabs>
-            <w:rPr>
-              <w:rFonts w:asciiTheme="minorHAnsi" w:eastAsiaTheme="minorEastAsia" w:hAnsiTheme="minorHAnsi" w:cstheme="minorBidi"/>
-              <w:noProof/>
-            </w:rPr>
-          </w:pPr>
-          <w:hyperlink w:anchor="_Toc125491525" w:history="1">
-            <w:r>
-              <w:rPr>
-                <w:rStyle w:val="Hyperlink"/>
-                <w:rFonts w:ascii="Ubuntu" w:hAnsi="Ubuntu"/>
-                <w:noProof/>
-              </w:rPr>
-              <w:t>4.2</w:t>
-            </w:r>
-            <w:r>
-              <w:rPr>
-                <w:rStyle w:val="Hyperlink"/>
-                <w:noProof/>
-              </w:rPr>
-              <w:t xml:space="preserve"> 3Sum | Find triplets that add up to a target value</w:t>
-            </w:r>
-            <w:r>
-              <w:rPr>
-                <w:noProof/>
-                <w:webHidden/>
-              </w:rPr>
-              <w:tab/>
-            </w:r>
-            <w:r>
-              <w:rPr>
-                <w:noProof/>
-                <w:webHidden/>
-              </w:rPr>
-              <w:fldChar w:fldCharType="begin"/>
-            </w:r>
-            <w:r>
-              <w:rPr>
-                <w:noProof/>
-                <w:webHidden/>
-              </w:rPr>
-              <w:instrText xml:space="preserve"> PAGEREF _Toc125491525 \h </w:instrText>
+              <w:instrText xml:space="preserve"> PAGEREF _Toc224137445 \h </w:instrText>
             </w:r>
             <w:r>
               <w:rPr>
@@ -1939,23 +1130,29 @@
             <w:rPr>
               <w:rFonts w:asciiTheme="minorHAnsi" w:eastAsiaTheme="minorEastAsia" w:hAnsiTheme="minorHAnsi" w:cstheme="minorBidi"/>
               <w:noProof/>
+              <w:kern w:val="2"/>
+              <w:sz w:val="24"/>
+              <w:szCs w:val="24"/>
+              <w14:ligatures w14:val="standardContextual"/>
             </w:rPr>
           </w:pPr>
-          <w:hyperlink w:anchor="_Toc125491526" w:history="1">
+          <w:hyperlink w:anchor="_Toc224137446" w:history="1">
             <w:r>
               <w:rPr>
                 <w:rStyle w:val="Hyperlink"/>
                 <w:rFonts w:ascii="Ubuntu" w:hAnsi="Ubuntu"/>
                 <w:noProof/>
+                <w:lang w:val="en-IN"/>
               </w:rPr>
-              <w:t>4.3</w:t>
+              <w:t>2.6</w:t>
             </w:r>
             <w:r>
               <w:rPr>
                 <w:rStyle w:val="Hyperlink"/>
                 <w:noProof/>
+                <w:lang w:val="en-IN"/>
               </w:rPr>
-              <w:t xml:space="preserve"> 4 Sum | Find Quads that add up to a target value</w:t>
+              <w:t xml:space="preserve"> Count inversions in an array</w:t>
             </w:r>
             <w:r>
               <w:rPr>
@@ -1976,84 +1173,7 @@
                 <w:noProof/>
                 <w:webHidden/>
               </w:rPr>
-              <w:instrText xml:space="preserve"> PAGEREF _Toc125491526 \h </w:instrText>
-            </w:r>
-            <w:r>
-              <w:rPr>
-                <w:noProof/>
-                <w:webHidden/>
-              </w:rPr>
-            </w:r>
-            <w:r>
-              <w:rPr>
-                <w:noProof/>
-                <w:webHidden/>
-              </w:rPr>
-              <w:fldChar w:fldCharType="separate"/>
-            </w:r>
-            <w:r>
-              <w:rPr>
-                <w:noProof/>
-                <w:webHidden/>
-              </w:rPr>
-              <w:t>19</w:t>
-            </w:r>
-            <w:r>
-              <w:rPr>
-                <w:noProof/>
-                <w:webHidden/>
-              </w:rPr>
-              <w:fldChar w:fldCharType="end"/>
-            </w:r>
-          </w:hyperlink>
-        </w:p>
-        <w:p>
-          <w:pPr>
-            <w:pStyle w:val="TOC3"/>
-            <w:tabs>
-              <w:tab w:val="right" w:leader="dot" w:pos="9350"/>
-            </w:tabs>
-            <w:rPr>
-              <w:rFonts w:asciiTheme="minorHAnsi" w:eastAsiaTheme="minorEastAsia" w:hAnsiTheme="minorHAnsi" w:cstheme="minorBidi"/>
-              <w:noProof/>
-            </w:rPr>
-          </w:pPr>
-          <w:hyperlink w:anchor="_Toc125491527" w:history="1">
-            <w:r>
-              <w:rPr>
-                <w:rStyle w:val="Hyperlink"/>
-                <w:rFonts w:ascii="Ubuntu" w:hAnsi="Ubuntu"/>
-                <w:noProof/>
-              </w:rPr>
-              <w:t>4.4</w:t>
-            </w:r>
-            <w:r>
-              <w:rPr>
-                <w:rStyle w:val="Hyperlink"/>
-                <w:noProof/>
-              </w:rPr>
-              <w:t xml:space="preserve"> Longest Consecutive Sequence in an Array</w:t>
-            </w:r>
-            <w:r>
-              <w:rPr>
-                <w:noProof/>
-                <w:webHidden/>
-              </w:rPr>
-              <w:tab/>
-            </w:r>
-            <w:r>
-              <w:rPr>
-                <w:noProof/>
-                <w:webHidden/>
-              </w:rPr>
-              <w:fldChar w:fldCharType="begin"/>
-            </w:r>
-            <w:r>
-              <w:rPr>
-                <w:noProof/>
-                <w:webHidden/>
-              </w:rPr>
-              <w:instrText xml:space="preserve"> PAGEREF _Toc125491527 \h </w:instrText>
+              <w:instrText xml:space="preserve"> PAGEREF _Toc224137446 \h </w:instrText>
             </w:r>
             <w:r>
               <w:rPr>
@@ -2086,32 +1206,34 @@
         </w:p>
         <w:p>
           <w:pPr>
-            <w:pStyle w:val="TOC3"/>
+            <w:pStyle w:val="TOC2"/>
             <w:tabs>
               <w:tab w:val="right" w:leader="dot" w:pos="9350"/>
             </w:tabs>
             <w:rPr>
               <w:rFonts w:asciiTheme="minorHAnsi" w:eastAsiaTheme="minorEastAsia" w:hAnsiTheme="minorHAnsi" w:cstheme="minorBidi"/>
               <w:noProof/>
+              <w:kern w:val="2"/>
+              <w:sz w:val="24"/>
+              <w:szCs w:val="24"/>
+              <w14:ligatures w14:val="standardContextual"/>
             </w:rPr>
           </w:pPr>
-          <w:hyperlink w:anchor="_Toc125491528" w:history="1">
+          <w:hyperlink w:anchor="_Toc224137447" w:history="1">
             <w:r>
               <w:rPr>
                 <w:rStyle w:val="Hyperlink"/>
                 <w:rFonts w:ascii="Ubuntu" w:hAnsi="Ubuntu"/>
                 <w:noProof/>
-                <w:lang w:val="en-IN"/>
               </w:rPr>
-              <w:t>4.5</w:t>
+              <w:t>3</w:t>
             </w:r>
             <w:r>
               <w:rPr>
                 <w:rStyle w:val="Hyperlink"/>
                 <w:noProof/>
-                <w:lang w:val="en-IN"/>
               </w:rPr>
-              <w:t xml:space="preserve"> Length of the longest subarray with zero Sum</w:t>
+              <w:t xml:space="preserve"> Arrays III</w:t>
             </w:r>
             <w:r>
               <w:rPr>
@@ -2132,86 +1254,7 @@
                 <w:noProof/>
                 <w:webHidden/>
               </w:rPr>
-              <w:instrText xml:space="preserve"> PAGEREF _Toc125491528 \h </w:instrText>
-            </w:r>
-            <w:r>
-              <w:rPr>
-                <w:noProof/>
-                <w:webHidden/>
-              </w:rPr>
-            </w:r>
-            <w:r>
-              <w:rPr>
-                <w:noProof/>
-                <w:webHidden/>
-              </w:rPr>
-              <w:fldChar w:fldCharType="separate"/>
-            </w:r>
-            <w:r>
-              <w:rPr>
-                <w:noProof/>
-                <w:webHidden/>
-              </w:rPr>
-              <w:t>21</w:t>
-            </w:r>
-            <w:r>
-              <w:rPr>
-                <w:noProof/>
-                <w:webHidden/>
-              </w:rPr>
-              <w:fldChar w:fldCharType="end"/>
-            </w:r>
-          </w:hyperlink>
-        </w:p>
-        <w:p>
-          <w:pPr>
-            <w:pStyle w:val="TOC3"/>
-            <w:tabs>
-              <w:tab w:val="right" w:leader="dot" w:pos="9350"/>
-            </w:tabs>
-            <w:rPr>
-              <w:rFonts w:asciiTheme="minorHAnsi" w:eastAsiaTheme="minorEastAsia" w:hAnsiTheme="minorHAnsi" w:cstheme="minorBidi"/>
-              <w:noProof/>
-            </w:rPr>
-          </w:pPr>
-          <w:hyperlink w:anchor="_Toc125491529" w:history="1">
-            <w:r>
-              <w:rPr>
-                <w:rStyle w:val="Hyperlink"/>
-                <w:rFonts w:ascii="Ubuntu" w:hAnsi="Ubuntu"/>
-                <w:noProof/>
-                <w:lang w:val="en-IN"/>
-              </w:rPr>
-              <w:t>4.6</w:t>
-            </w:r>
-            <w:r>
-              <w:rPr>
-                <w:rStyle w:val="Hyperlink"/>
-                <w:noProof/>
-                <w:lang w:val="en-IN"/>
-              </w:rPr>
-              <w:t xml:space="preserve"> Count the number of subarrays with given xor K</w:t>
-            </w:r>
-            <w:r>
-              <w:rPr>
-                <w:noProof/>
-                <w:webHidden/>
-              </w:rPr>
-              <w:tab/>
-            </w:r>
-            <w:r>
-              <w:rPr>
-                <w:noProof/>
-                <w:webHidden/>
-              </w:rPr>
-              <w:fldChar w:fldCharType="begin"/>
-            </w:r>
-            <w:r>
-              <w:rPr>
-                <w:noProof/>
-                <w:webHidden/>
-              </w:rPr>
-              <w:instrText xml:space="preserve"> PAGEREF _Toc125491529 \h </w:instrText>
+              <w:instrText xml:space="preserve"> PAGEREF _Toc224137447 \h </w:instrText>
             </w:r>
             <w:r>
               <w:rPr>
@@ -2251,25 +1294,27 @@
             <w:rPr>
               <w:rFonts w:asciiTheme="minorHAnsi" w:eastAsiaTheme="minorEastAsia" w:hAnsiTheme="minorHAnsi" w:cstheme="minorBidi"/>
               <w:noProof/>
+              <w:kern w:val="2"/>
+              <w:sz w:val="24"/>
+              <w:szCs w:val="24"/>
+              <w14:ligatures w14:val="standardContextual"/>
             </w:rPr>
           </w:pPr>
-          <w:hyperlink w:anchor="_Toc125491530" w:history="1">
+          <w:hyperlink w:anchor="_Toc224137448" w:history="1">
             <w:r>
               <w:rPr>
                 <w:rStyle w:val="Hyperlink"/>
                 <w:rFonts w:ascii="Ubuntu" w:hAnsi="Ubuntu"/>
                 <w:noProof/>
-                <w:lang w:val="en-IN"/>
               </w:rPr>
-              <w:t>4.7</w:t>
+              <w:t>3.1</w:t>
             </w:r>
             <w:r>
               <w:rPr>
                 <w:rStyle w:val="Hyperlink"/>
                 <w:noProof/>
-                <w:lang w:val="en-IN"/>
               </w:rPr>
-              <w:t xml:space="preserve"> Longest Substring Without Repeating Characters</w:t>
+              <w:t xml:space="preserve"> Search in a sorted 2D matrix</w:t>
             </w:r>
             <w:r>
               <w:rPr>
@@ -2290,7 +1335,90 @@
                 <w:noProof/>
                 <w:webHidden/>
               </w:rPr>
-              <w:instrText xml:space="preserve"> PAGEREF _Toc125491530 \h </w:instrText>
+              <w:instrText xml:space="preserve"> PAGEREF _Toc224137448 \h </w:instrText>
+            </w:r>
+            <w:r>
+              <w:rPr>
+                <w:noProof/>
+                <w:webHidden/>
+              </w:rPr>
+            </w:r>
+            <w:r>
+              <w:rPr>
+                <w:noProof/>
+                <w:webHidden/>
+              </w:rPr>
+              <w:fldChar w:fldCharType="separate"/>
+            </w:r>
+            <w:r>
+              <w:rPr>
+                <w:noProof/>
+                <w:webHidden/>
+              </w:rPr>
+              <w:t>22</w:t>
+            </w:r>
+            <w:r>
+              <w:rPr>
+                <w:noProof/>
+                <w:webHidden/>
+              </w:rPr>
+              <w:fldChar w:fldCharType="end"/>
+            </w:r>
+          </w:hyperlink>
+        </w:p>
+        <w:p>
+          <w:pPr>
+            <w:pStyle w:val="TOC3"/>
+            <w:tabs>
+              <w:tab w:val="right" w:leader="dot" w:pos="9350"/>
+            </w:tabs>
+            <w:rPr>
+              <w:rFonts w:asciiTheme="minorHAnsi" w:eastAsiaTheme="minorEastAsia" w:hAnsiTheme="minorHAnsi" w:cstheme="minorBidi"/>
+              <w:noProof/>
+              <w:kern w:val="2"/>
+              <w:sz w:val="24"/>
+              <w:szCs w:val="24"/>
+              <w14:ligatures w14:val="standardContextual"/>
+            </w:rPr>
+          </w:pPr>
+          <w:hyperlink w:anchor="_Toc224137449" w:history="1">
+            <w:r>
+              <w:rPr>
+                <w:rStyle w:val="Hyperlink"/>
+                <w:rFonts w:ascii="Ubuntu" w:hAnsi="Ubuntu"/>
+                <w:noProof/>
+                <w:lang w:val="en-IN"/>
+              </w:rPr>
+              <w:t>3.2</w:t>
+            </w:r>
+            <w:r>
+              <w:rPr>
+                <w:rStyle w:val="Hyperlink"/>
+                <w:noProof/>
+                <w:lang w:val="en-IN"/>
+              </w:rPr>
+              <w:t xml:space="preserve"> Implement Pow(x,n) | X raised to the power N</w:t>
+            </w:r>
+            <w:r>
+              <w:rPr>
+                <w:noProof/>
+                <w:webHidden/>
+              </w:rPr>
+              <w:tab/>
+            </w:r>
+            <w:r>
+              <w:rPr>
+                <w:noProof/>
+                <w:webHidden/>
+              </w:rPr>
+              <w:fldChar w:fldCharType="begin"/>
+            </w:r>
+            <w:r>
+              <w:rPr>
+                <w:noProof/>
+                <w:webHidden/>
+              </w:rPr>
+              <w:instrText xml:space="preserve"> PAGEREF _Toc224137449 \h </w:instrText>
             </w:r>
             <w:r>
               <w:rPr>
@@ -2323,30 +1451,36 @@
         </w:p>
         <w:p>
           <w:pPr>
-            <w:pStyle w:val="TOC2"/>
+            <w:pStyle w:val="TOC3"/>
             <w:tabs>
               <w:tab w:val="right" w:leader="dot" w:pos="9350"/>
             </w:tabs>
             <w:rPr>
               <w:rFonts w:asciiTheme="minorHAnsi" w:eastAsiaTheme="minorEastAsia" w:hAnsiTheme="minorHAnsi" w:cstheme="minorBidi"/>
               <w:noProof/>
+              <w:kern w:val="2"/>
+              <w:sz w:val="24"/>
+              <w:szCs w:val="24"/>
+              <w14:ligatures w14:val="standardContextual"/>
             </w:rPr>
           </w:pPr>
-          <w:hyperlink w:anchor="_Toc125491531" w:history="1">
+          <w:hyperlink w:anchor="_Toc224137450" w:history="1">
             <w:r>
               <w:rPr>
                 <w:rStyle w:val="Hyperlink"/>
                 <w:rFonts w:ascii="Ubuntu" w:hAnsi="Ubuntu"/>
                 <w:noProof/>
+                <w:lang w:val="en-IN"/>
               </w:rPr>
-              <w:t>5</w:t>
+              <w:t>3.3</w:t>
             </w:r>
             <w:r>
               <w:rPr>
                 <w:rStyle w:val="Hyperlink"/>
                 <w:noProof/>
+                <w:lang w:val="en-IN"/>
               </w:rPr>
-              <w:t xml:space="preserve"> Linked List</w:t>
+              <w:t xml:space="preserve"> Find the Majority Element that occurs more than N/2 times</w:t>
             </w:r>
             <w:r>
               <w:rPr>
@@ -2367,7 +1501,90 @@
                 <w:noProof/>
                 <w:webHidden/>
               </w:rPr>
-              <w:instrText xml:space="preserve"> PAGEREF _Toc125491531 \h </w:instrText>
+              <w:instrText xml:space="preserve"> PAGEREF _Toc224137450 \h </w:instrText>
+            </w:r>
+            <w:r>
+              <w:rPr>
+                <w:noProof/>
+                <w:webHidden/>
+              </w:rPr>
+            </w:r>
+            <w:r>
+              <w:rPr>
+                <w:noProof/>
+                <w:webHidden/>
+              </w:rPr>
+              <w:fldChar w:fldCharType="separate"/>
+            </w:r>
+            <w:r>
+              <w:rPr>
+                <w:noProof/>
+                <w:webHidden/>
+              </w:rPr>
+              <w:t>24</w:t>
+            </w:r>
+            <w:r>
+              <w:rPr>
+                <w:noProof/>
+                <w:webHidden/>
+              </w:rPr>
+              <w:fldChar w:fldCharType="end"/>
+            </w:r>
+          </w:hyperlink>
+        </w:p>
+        <w:p>
+          <w:pPr>
+            <w:pStyle w:val="TOC3"/>
+            <w:tabs>
+              <w:tab w:val="right" w:leader="dot" w:pos="9350"/>
+            </w:tabs>
+            <w:rPr>
+              <w:rFonts w:asciiTheme="minorHAnsi" w:eastAsiaTheme="minorEastAsia" w:hAnsiTheme="minorHAnsi" w:cstheme="minorBidi"/>
+              <w:noProof/>
+              <w:kern w:val="2"/>
+              <w:sz w:val="24"/>
+              <w:szCs w:val="24"/>
+              <w14:ligatures w14:val="standardContextual"/>
+            </w:rPr>
+          </w:pPr>
+          <w:hyperlink w:anchor="_Toc224137451" w:history="1">
+            <w:r>
+              <w:rPr>
+                <w:rStyle w:val="Hyperlink"/>
+                <w:rFonts w:ascii="Ubuntu" w:hAnsi="Ubuntu"/>
+                <w:noProof/>
+                <w:lang w:val="en-IN"/>
+              </w:rPr>
+              <w:t>3.4</w:t>
+            </w:r>
+            <w:r>
+              <w:rPr>
+                <w:rStyle w:val="Hyperlink"/>
+                <w:noProof/>
+                <w:lang w:val="en-IN"/>
+              </w:rPr>
+              <w:t xml:space="preserve"> Majority Elements(&gt;N/3 times)</w:t>
+            </w:r>
+            <w:r>
+              <w:rPr>
+                <w:noProof/>
+                <w:webHidden/>
+              </w:rPr>
+              <w:tab/>
+            </w:r>
+            <w:r>
+              <w:rPr>
+                <w:noProof/>
+                <w:webHidden/>
+              </w:rPr>
+              <w:fldChar w:fldCharType="begin"/>
+            </w:r>
+            <w:r>
+              <w:rPr>
+                <w:noProof/>
+                <w:webHidden/>
+              </w:rPr>
+              <w:instrText xml:space="preserve"> PAGEREF _Toc224137451 \h </w:instrText>
             </w:r>
             <w:r>
               <w:rPr>
@@ -2407,23 +1624,29 @@
             <w:rPr>
               <w:rFonts w:asciiTheme="minorHAnsi" w:eastAsiaTheme="minorEastAsia" w:hAnsiTheme="minorHAnsi" w:cstheme="minorBidi"/>
               <w:noProof/>
+              <w:kern w:val="2"/>
+              <w:sz w:val="24"/>
+              <w:szCs w:val="24"/>
+              <w14:ligatures w14:val="standardContextual"/>
             </w:rPr>
           </w:pPr>
-          <w:hyperlink w:anchor="_Toc125491532" w:history="1">
+          <w:hyperlink w:anchor="_Toc224137452" w:history="1">
             <w:r>
               <w:rPr>
                 <w:rStyle w:val="Hyperlink"/>
                 <w:rFonts w:ascii="Ubuntu" w:hAnsi="Ubuntu"/>
                 <w:noProof/>
+                <w:lang w:val="en-IN"/>
               </w:rPr>
-              <w:t>5.1</w:t>
+              <w:t>3.5</w:t>
             </w:r>
             <w:r>
               <w:rPr>
                 <w:rStyle w:val="Hyperlink"/>
                 <w:noProof/>
+                <w:lang w:val="en-IN"/>
               </w:rPr>
-              <w:t xml:space="preserve"> Reverse a Linked List</w:t>
+              <w:t xml:space="preserve"> Grid Unique Paths</w:t>
             </w:r>
             <w:r>
               <w:rPr>
@@ -2444,86 +1667,7 @@
                 <w:noProof/>
                 <w:webHidden/>
               </w:rPr>
-              <w:instrText xml:space="preserve"> PAGEREF _Toc125491532 \h </w:instrText>
-            </w:r>
-            <w:r>
-              <w:rPr>
-                <w:noProof/>
-                <w:webHidden/>
-              </w:rPr>
-            </w:r>
-            <w:r>
-              <w:rPr>
-                <w:noProof/>
-                <w:webHidden/>
-              </w:rPr>
-              <w:fldChar w:fldCharType="separate"/>
-            </w:r>
-            <w:r>
-              <w:rPr>
-                <w:noProof/>
-                <w:webHidden/>
-              </w:rPr>
-              <w:t>25</w:t>
-            </w:r>
-            <w:r>
-              <w:rPr>
-                <w:noProof/>
-                <w:webHidden/>
-              </w:rPr>
-              <w:fldChar w:fldCharType="end"/>
-            </w:r>
-          </w:hyperlink>
-        </w:p>
-        <w:p>
-          <w:pPr>
-            <w:pStyle w:val="TOC3"/>
-            <w:tabs>
-              <w:tab w:val="right" w:leader="dot" w:pos="9350"/>
-            </w:tabs>
-            <w:rPr>
-              <w:rFonts w:asciiTheme="minorHAnsi" w:eastAsiaTheme="minorEastAsia" w:hAnsiTheme="minorHAnsi" w:cstheme="minorBidi"/>
-              <w:noProof/>
-            </w:rPr>
-          </w:pPr>
-          <w:hyperlink w:anchor="_Toc125491533" w:history="1">
-            <w:r>
-              <w:rPr>
-                <w:rStyle w:val="Hyperlink"/>
-                <w:rFonts w:ascii="Ubuntu" w:hAnsi="Ubuntu"/>
-                <w:noProof/>
-                <w:lang w:val="en-IN"/>
-              </w:rPr>
-              <w:t>5.2</w:t>
-            </w:r>
-            <w:r>
-              <w:rPr>
-                <w:rStyle w:val="Hyperlink"/>
-                <w:noProof/>
-                <w:lang w:val="en-IN"/>
-              </w:rPr>
-              <w:t xml:space="preserve"> Middle of the Linked List</w:t>
-            </w:r>
-            <w:r>
-              <w:rPr>
-                <w:noProof/>
-                <w:webHidden/>
-              </w:rPr>
-              <w:tab/>
-            </w:r>
-            <w:r>
-              <w:rPr>
-                <w:noProof/>
-                <w:webHidden/>
-              </w:rPr>
-              <w:fldChar w:fldCharType="begin"/>
-            </w:r>
-            <w:r>
-              <w:rPr>
-                <w:noProof/>
-                <w:webHidden/>
-              </w:rPr>
-              <w:instrText xml:space="preserve"> PAGEREF _Toc125491533 \h </w:instrText>
+              <w:instrText xml:space="preserve"> PAGEREF _Toc224137452 \h </w:instrText>
             </w:r>
             <w:r>
               <w:rPr>
@@ -2563,9 +1707,13 @@
             <w:rPr>
               <w:rFonts w:asciiTheme="minorHAnsi" w:eastAsiaTheme="minorEastAsia" w:hAnsiTheme="minorHAnsi" w:cstheme="minorBidi"/>
               <w:noProof/>
+              <w:kern w:val="2"/>
+              <w:sz w:val="24"/>
+              <w:szCs w:val="24"/>
+              <w14:ligatures w14:val="standardContextual"/>
             </w:rPr>
           </w:pPr>
-          <w:hyperlink w:anchor="_Toc125491534" w:history="1">
+          <w:hyperlink w:anchor="_Toc224137453" w:history="1">
             <w:r>
               <w:rPr>
                 <w:rStyle w:val="Hyperlink"/>
@@ -2573,7 +1721,7 @@
                 <w:noProof/>
                 <w:lang w:val="en-IN"/>
               </w:rPr>
-              <w:t>5.3</w:t>
+              <w:t>3.6</w:t>
             </w:r>
             <w:r>
               <w:rPr>
@@ -2581,7 +1729,7 @@
                 <w:noProof/>
                 <w:lang w:val="en-IN"/>
               </w:rPr>
-              <w:t xml:space="preserve"> Merge Two Sorted Lists</w:t>
+              <w:t xml:space="preserve"> Count Reverse Pairs</w:t>
             </w:r>
             <w:r>
               <w:rPr>
@@ -2602,86 +1750,7 @@
                 <w:noProof/>
                 <w:webHidden/>
               </w:rPr>
-              <w:instrText xml:space="preserve"> PAGEREF _Toc125491534 \h </w:instrText>
-            </w:r>
-            <w:r>
-              <w:rPr>
-                <w:noProof/>
-                <w:webHidden/>
-              </w:rPr>
-            </w:r>
-            <w:r>
-              <w:rPr>
-                <w:noProof/>
-                <w:webHidden/>
-              </w:rPr>
-              <w:fldChar w:fldCharType="separate"/>
-            </w:r>
-            <w:r>
-              <w:rPr>
-                <w:noProof/>
-                <w:webHidden/>
-              </w:rPr>
-              <w:t>26</w:t>
-            </w:r>
-            <w:r>
-              <w:rPr>
-                <w:noProof/>
-                <w:webHidden/>
-              </w:rPr>
-              <w:fldChar w:fldCharType="end"/>
-            </w:r>
-          </w:hyperlink>
-        </w:p>
-        <w:p>
-          <w:pPr>
-            <w:pStyle w:val="TOC3"/>
-            <w:tabs>
-              <w:tab w:val="right" w:leader="dot" w:pos="9350"/>
-            </w:tabs>
-            <w:rPr>
-              <w:rFonts w:asciiTheme="minorHAnsi" w:eastAsiaTheme="minorEastAsia" w:hAnsiTheme="minorHAnsi" w:cstheme="minorBidi"/>
-              <w:noProof/>
-            </w:rPr>
-          </w:pPr>
-          <w:hyperlink w:anchor="_Toc125491535" w:history="1">
-            <w:r>
-              <w:rPr>
-                <w:rStyle w:val="Hyperlink"/>
-                <w:rFonts w:ascii="Ubuntu" w:hAnsi="Ubuntu"/>
-                <w:noProof/>
-                <w:lang w:val="en-IN"/>
-              </w:rPr>
-              <w:t>5.4</w:t>
-            </w:r>
-            <w:r>
-              <w:rPr>
-                <w:rStyle w:val="Hyperlink"/>
-                <w:noProof/>
-                <w:lang w:val="en-IN"/>
-              </w:rPr>
-              <w:t xml:space="preserve"> Remove Nth Node From End of List</w:t>
-            </w:r>
-            <w:r>
-              <w:rPr>
-                <w:noProof/>
-                <w:webHidden/>
-              </w:rPr>
-              <w:tab/>
-            </w:r>
-            <w:r>
-              <w:rPr>
-                <w:noProof/>
-                <w:webHidden/>
-              </w:rPr>
-              <w:fldChar w:fldCharType="begin"/>
-            </w:r>
-            <w:r>
-              <w:rPr>
-                <w:noProof/>
-                <w:webHidden/>
-              </w:rPr>
-              <w:instrText xml:space="preserve"> PAGEREF _Toc125491535 \h </w:instrText>
+              <w:instrText xml:space="preserve"> PAGEREF _Toc224137453 \h </w:instrText>
             </w:r>
             <w:r>
               <w:rPr>
@@ -2714,30 +1783,34 @@
         </w:p>
         <w:p>
           <w:pPr>
-            <w:pStyle w:val="TOC3"/>
+            <w:pStyle w:val="TOC2"/>
             <w:tabs>
               <w:tab w:val="right" w:leader="dot" w:pos="9350"/>
             </w:tabs>
             <w:rPr>
               <w:rFonts w:asciiTheme="minorHAnsi" w:eastAsiaTheme="minorEastAsia" w:hAnsiTheme="minorHAnsi" w:cstheme="minorBidi"/>
               <w:noProof/>
+              <w:kern w:val="2"/>
+              <w:sz w:val="24"/>
+              <w:szCs w:val="24"/>
+              <w14:ligatures w14:val="standardContextual"/>
             </w:rPr>
           </w:pPr>
-          <w:hyperlink w:anchor="_Toc125491536" w:history="1">
+          <w:hyperlink w:anchor="_Toc224137454" w:history="1">
             <w:r>
               <w:rPr>
                 <w:rStyle w:val="Hyperlink"/>
                 <w:rFonts w:ascii="Ubuntu" w:hAnsi="Ubuntu"/>
                 <w:noProof/>
               </w:rPr>
-              <w:t>5.5</w:t>
+              <w:t>4</w:t>
             </w:r>
             <w:r>
               <w:rPr>
                 <w:rStyle w:val="Hyperlink"/>
                 <w:noProof/>
               </w:rPr>
-              <w:t xml:space="preserve"> Add two numbers represented as Linked Lists</w:t>
+              <w:t xml:space="preserve"> Arrays IV</w:t>
             </w:r>
             <w:r>
               <w:rPr>
@@ -2758,161 +1831,7 @@
                 <w:noProof/>
                 <w:webHidden/>
               </w:rPr>
-              <w:instrText xml:space="preserve"> PAGEREF _Toc125491536 \h </w:instrText>
-            </w:r>
-            <w:r>
-              <w:rPr>
-                <w:noProof/>
-                <w:webHidden/>
-              </w:rPr>
-            </w:r>
-            <w:r>
-              <w:rPr>
-                <w:noProof/>
-                <w:webHidden/>
-              </w:rPr>
-              <w:fldChar w:fldCharType="separate"/>
-            </w:r>
-            <w:r>
-              <w:rPr>
-                <w:noProof/>
-                <w:webHidden/>
-              </w:rPr>
-              <w:t>28</w:t>
-            </w:r>
-            <w:r>
-              <w:rPr>
-                <w:noProof/>
-                <w:webHidden/>
-              </w:rPr>
-              <w:fldChar w:fldCharType="end"/>
-            </w:r>
-          </w:hyperlink>
-        </w:p>
-        <w:p>
-          <w:pPr>
-            <w:pStyle w:val="TOC3"/>
-            <w:tabs>
-              <w:tab w:val="right" w:leader="dot" w:pos="9350"/>
-            </w:tabs>
-            <w:rPr>
-              <w:rFonts w:asciiTheme="minorHAnsi" w:eastAsiaTheme="minorEastAsia" w:hAnsiTheme="minorHAnsi" w:cstheme="minorBidi"/>
-              <w:noProof/>
-            </w:rPr>
-          </w:pPr>
-          <w:hyperlink w:anchor="_Toc125491537" w:history="1">
-            <w:r>
-              <w:rPr>
-                <w:rStyle w:val="Hyperlink"/>
-                <w:rFonts w:ascii="Ubuntu" w:hAnsi="Ubuntu"/>
-                <w:noProof/>
-              </w:rPr>
-              <w:t>5.6</w:t>
-            </w:r>
-            <w:r>
-              <w:rPr>
-                <w:rStyle w:val="Hyperlink"/>
-                <w:noProof/>
-              </w:rPr>
-              <w:t xml:space="preserve"> Delete given node in a Linked List: O (1) approach</w:t>
-            </w:r>
-            <w:r>
-              <w:rPr>
-                <w:noProof/>
-                <w:webHidden/>
-              </w:rPr>
-              <w:tab/>
-            </w:r>
-            <w:r>
-              <w:rPr>
-                <w:noProof/>
-                <w:webHidden/>
-              </w:rPr>
-              <w:fldChar w:fldCharType="begin"/>
-            </w:r>
-            <w:r>
-              <w:rPr>
-                <w:noProof/>
-                <w:webHidden/>
-              </w:rPr>
-              <w:instrText xml:space="preserve"> PAGEREF _Toc125491537 \h </w:instrText>
-            </w:r>
-            <w:r>
-              <w:rPr>
-                <w:noProof/>
-                <w:webHidden/>
-              </w:rPr>
-            </w:r>
-            <w:r>
-              <w:rPr>
-                <w:noProof/>
-                <w:webHidden/>
-              </w:rPr>
-              <w:fldChar w:fldCharType="separate"/>
-            </w:r>
-            <w:r>
-              <w:rPr>
-                <w:noProof/>
-                <w:webHidden/>
-              </w:rPr>
-              <w:t>28</w:t>
-            </w:r>
-            <w:r>
-              <w:rPr>
-                <w:noProof/>
-                <w:webHidden/>
-              </w:rPr>
-              <w:fldChar w:fldCharType="end"/>
-            </w:r>
-          </w:hyperlink>
-        </w:p>
-        <w:p>
-          <w:pPr>
-            <w:pStyle w:val="TOC2"/>
-            <w:tabs>
-              <w:tab w:val="right" w:leader="dot" w:pos="9350"/>
-            </w:tabs>
-            <w:rPr>
-              <w:rFonts w:asciiTheme="minorHAnsi" w:eastAsiaTheme="minorEastAsia" w:hAnsiTheme="minorHAnsi" w:cstheme="minorBidi"/>
-              <w:noProof/>
-            </w:rPr>
-          </w:pPr>
-          <w:hyperlink w:anchor="_Toc125491538" w:history="1">
-            <w:r>
-              <w:rPr>
-                <w:rStyle w:val="Hyperlink"/>
-                <w:rFonts w:ascii="Ubuntu" w:hAnsi="Ubuntu"/>
-                <w:noProof/>
-              </w:rPr>
-              <w:t>6</w:t>
-            </w:r>
-            <w:r>
-              <w:rPr>
-                <w:rStyle w:val="Hyperlink"/>
-                <w:noProof/>
-              </w:rPr>
-              <w:t xml:space="preserve"> Linked List Part-II</w:t>
-            </w:r>
-            <w:r>
-              <w:rPr>
-                <w:noProof/>
-                <w:webHidden/>
-              </w:rPr>
-              <w:tab/>
-            </w:r>
-            <w:r>
-              <w:rPr>
-                <w:noProof/>
-                <w:webHidden/>
-              </w:rPr>
-              <w:fldChar w:fldCharType="begin"/>
-            </w:r>
-            <w:r>
-              <w:rPr>
-                <w:noProof/>
-                <w:webHidden/>
-              </w:rPr>
-              <w:instrText xml:space="preserve"> PAGEREF _Toc125491538 \h </w:instrText>
+              <w:instrText xml:space="preserve"> PAGEREF _Toc224137454 \h </w:instrText>
             </w:r>
             <w:r>
               <w:rPr>
@@ -2952,9 +1871,13 @@
             <w:rPr>
               <w:rFonts w:asciiTheme="minorHAnsi" w:eastAsiaTheme="minorEastAsia" w:hAnsiTheme="minorHAnsi" w:cstheme="minorBidi"/>
               <w:noProof/>
+              <w:kern w:val="2"/>
+              <w:sz w:val="24"/>
+              <w:szCs w:val="24"/>
+              <w14:ligatures w14:val="standardContextual"/>
             </w:rPr>
           </w:pPr>
-          <w:hyperlink w:anchor="_Toc125491539" w:history="1">
+          <w:hyperlink w:anchor="_Toc224137455" w:history="1">
             <w:r>
               <w:rPr>
                 <w:rStyle w:val="Hyperlink"/>
@@ -2962,7 +1885,7 @@
                 <w:noProof/>
                 <w:lang w:val="en-IN"/>
               </w:rPr>
-              <w:t>6.1</w:t>
+              <w:t>4.1</w:t>
             </w:r>
             <w:r>
               <w:rPr>
@@ -2970,7 +1893,7 @@
                 <w:noProof/>
                 <w:lang w:val="en-IN"/>
               </w:rPr>
-              <w:t xml:space="preserve"> Find intersection of Two Linked Lists</w:t>
+              <w:t xml:space="preserve"> Two Sum</w:t>
             </w:r>
             <w:r>
               <w:rPr>
@@ -2991,7 +1914,7 @@
                 <w:noProof/>
                 <w:webHidden/>
               </w:rPr>
-              <w:instrText xml:space="preserve"> PAGEREF _Toc125491539 \h </w:instrText>
+              <w:instrText xml:space="preserve"> PAGEREF _Toc224137455 \h </w:instrText>
             </w:r>
             <w:r>
               <w:rPr>
@@ -3023,6 +1946,662 @@
           </w:hyperlink>
         </w:p>
         <w:p>
+          <w:pPr>
+            <w:pStyle w:val="TOC3"/>
+            <w:tabs>
+              <w:tab w:val="right" w:leader="dot" w:pos="9350"/>
+            </w:tabs>
+            <w:rPr>
+              <w:rFonts w:asciiTheme="minorHAnsi" w:eastAsiaTheme="minorEastAsia" w:hAnsiTheme="minorHAnsi" w:cstheme="minorBidi"/>
+              <w:noProof/>
+              <w:kern w:val="2"/>
+              <w:sz w:val="24"/>
+              <w:szCs w:val="24"/>
+              <w14:ligatures w14:val="standardContextual"/>
+            </w:rPr>
+          </w:pPr>
+          <w:hyperlink w:anchor="_Toc224137456" w:history="1">
+            <w:r>
+              <w:rPr>
+                <w:rStyle w:val="Hyperlink"/>
+                <w:rFonts w:ascii="Ubuntu" w:hAnsi="Ubuntu"/>
+                <w:noProof/>
+              </w:rPr>
+              <w:t>4.2</w:t>
+            </w:r>
+            <w:r>
+              <w:rPr>
+                <w:rStyle w:val="Hyperlink"/>
+                <w:noProof/>
+              </w:rPr>
+              <w:t xml:space="preserve"> 3Sum | Find triplets that add up to a target value</w:t>
+            </w:r>
+            <w:r>
+              <w:rPr>
+                <w:noProof/>
+                <w:webHidden/>
+              </w:rPr>
+              <w:tab/>
+            </w:r>
+            <w:r>
+              <w:rPr>
+                <w:noProof/>
+                <w:webHidden/>
+              </w:rPr>
+              <w:fldChar w:fldCharType="begin"/>
+            </w:r>
+            <w:r>
+              <w:rPr>
+                <w:noProof/>
+                <w:webHidden/>
+              </w:rPr>
+              <w:instrText xml:space="preserve"> PAGEREF _Toc224137456 \h </w:instrText>
+            </w:r>
+            <w:r>
+              <w:rPr>
+                <w:noProof/>
+                <w:webHidden/>
+              </w:rPr>
+            </w:r>
+            <w:r>
+              <w:rPr>
+                <w:noProof/>
+                <w:webHidden/>
+              </w:rPr>
+              <w:fldChar w:fldCharType="separate"/>
+            </w:r>
+            <w:r>
+              <w:rPr>
+                <w:noProof/>
+                <w:webHidden/>
+              </w:rPr>
+              <w:t>30</w:t>
+            </w:r>
+            <w:r>
+              <w:rPr>
+                <w:noProof/>
+                <w:webHidden/>
+              </w:rPr>
+              <w:fldChar w:fldCharType="end"/>
+            </w:r>
+          </w:hyperlink>
+        </w:p>
+        <w:p>
+          <w:pPr>
+            <w:pStyle w:val="TOC3"/>
+            <w:tabs>
+              <w:tab w:val="right" w:leader="dot" w:pos="9350"/>
+            </w:tabs>
+            <w:rPr>
+              <w:rFonts w:asciiTheme="minorHAnsi" w:eastAsiaTheme="minorEastAsia" w:hAnsiTheme="minorHAnsi" w:cstheme="minorBidi"/>
+              <w:noProof/>
+              <w:kern w:val="2"/>
+              <w:sz w:val="24"/>
+              <w:szCs w:val="24"/>
+              <w14:ligatures w14:val="standardContextual"/>
+            </w:rPr>
+          </w:pPr>
+          <w:hyperlink w:anchor="_Toc224137457" w:history="1">
+            <w:r>
+              <w:rPr>
+                <w:rStyle w:val="Hyperlink"/>
+                <w:rFonts w:ascii="Ubuntu" w:hAnsi="Ubuntu"/>
+                <w:noProof/>
+              </w:rPr>
+              <w:t>4.3</w:t>
+            </w:r>
+            <w:r>
+              <w:rPr>
+                <w:rStyle w:val="Hyperlink"/>
+                <w:noProof/>
+              </w:rPr>
+              <w:t xml:space="preserve"> 4 Sum | Find Quads that add up to a target value</w:t>
+            </w:r>
+            <w:r>
+              <w:rPr>
+                <w:noProof/>
+                <w:webHidden/>
+              </w:rPr>
+              <w:tab/>
+            </w:r>
+            <w:r>
+              <w:rPr>
+                <w:noProof/>
+                <w:webHidden/>
+              </w:rPr>
+              <w:fldChar w:fldCharType="begin"/>
+            </w:r>
+            <w:r>
+              <w:rPr>
+                <w:noProof/>
+                <w:webHidden/>
+              </w:rPr>
+              <w:instrText xml:space="preserve"> PAGEREF _Toc224137457 \h </w:instrText>
+            </w:r>
+            <w:r>
+              <w:rPr>
+                <w:noProof/>
+                <w:webHidden/>
+              </w:rPr>
+            </w:r>
+            <w:r>
+              <w:rPr>
+                <w:noProof/>
+                <w:webHidden/>
+              </w:rPr>
+              <w:fldChar w:fldCharType="separate"/>
+            </w:r>
+            <w:r>
+              <w:rPr>
+                <w:noProof/>
+                <w:webHidden/>
+              </w:rPr>
+              <w:t>31</w:t>
+            </w:r>
+            <w:r>
+              <w:rPr>
+                <w:noProof/>
+                <w:webHidden/>
+              </w:rPr>
+              <w:fldChar w:fldCharType="end"/>
+            </w:r>
+          </w:hyperlink>
+        </w:p>
+        <w:p>
+          <w:pPr>
+            <w:pStyle w:val="TOC3"/>
+            <w:tabs>
+              <w:tab w:val="right" w:leader="dot" w:pos="9350"/>
+            </w:tabs>
+            <w:rPr>
+              <w:rFonts w:asciiTheme="minorHAnsi" w:eastAsiaTheme="minorEastAsia" w:hAnsiTheme="minorHAnsi" w:cstheme="minorBidi"/>
+              <w:noProof/>
+              <w:kern w:val="2"/>
+              <w:sz w:val="24"/>
+              <w:szCs w:val="24"/>
+              <w14:ligatures w14:val="standardContextual"/>
+            </w:rPr>
+          </w:pPr>
+          <w:hyperlink w:anchor="_Toc224137458" w:history="1">
+            <w:r>
+              <w:rPr>
+                <w:rStyle w:val="Hyperlink"/>
+                <w:rFonts w:ascii="Ubuntu" w:hAnsi="Ubuntu"/>
+                <w:noProof/>
+              </w:rPr>
+              <w:t>4.4</w:t>
+            </w:r>
+            <w:r>
+              <w:rPr>
+                <w:rStyle w:val="Hyperlink"/>
+                <w:noProof/>
+              </w:rPr>
+              <w:t xml:space="preserve"> Longest Consecutive Sequence in an Array</w:t>
+            </w:r>
+            <w:r>
+              <w:rPr>
+                <w:noProof/>
+                <w:webHidden/>
+              </w:rPr>
+              <w:tab/>
+            </w:r>
+            <w:r>
+              <w:rPr>
+                <w:noProof/>
+                <w:webHidden/>
+              </w:rPr>
+              <w:fldChar w:fldCharType="begin"/>
+            </w:r>
+            <w:r>
+              <w:rPr>
+                <w:noProof/>
+                <w:webHidden/>
+              </w:rPr>
+              <w:instrText xml:space="preserve"> PAGEREF _Toc224137458 \h </w:instrText>
+            </w:r>
+            <w:r>
+              <w:rPr>
+                <w:noProof/>
+                <w:webHidden/>
+              </w:rPr>
+            </w:r>
+            <w:r>
+              <w:rPr>
+                <w:noProof/>
+                <w:webHidden/>
+              </w:rPr>
+              <w:fldChar w:fldCharType="separate"/>
+            </w:r>
+            <w:r>
+              <w:rPr>
+                <w:noProof/>
+                <w:webHidden/>
+              </w:rPr>
+              <w:t>33</w:t>
+            </w:r>
+            <w:r>
+              <w:rPr>
+                <w:noProof/>
+                <w:webHidden/>
+              </w:rPr>
+              <w:fldChar w:fldCharType="end"/>
+            </w:r>
+          </w:hyperlink>
+        </w:p>
+        <w:p>
+          <w:pPr>
+            <w:pStyle w:val="TOC3"/>
+            <w:tabs>
+              <w:tab w:val="right" w:leader="dot" w:pos="9350"/>
+            </w:tabs>
+            <w:rPr>
+              <w:rFonts w:asciiTheme="minorHAnsi" w:eastAsiaTheme="minorEastAsia" w:hAnsiTheme="minorHAnsi" w:cstheme="minorBidi"/>
+              <w:noProof/>
+              <w:kern w:val="2"/>
+              <w:sz w:val="24"/>
+              <w:szCs w:val="24"/>
+              <w14:ligatures w14:val="standardContextual"/>
+            </w:rPr>
+          </w:pPr>
+          <w:hyperlink w:anchor="_Toc224137459" w:history="1">
+            <w:r>
+              <w:rPr>
+                <w:rStyle w:val="Hyperlink"/>
+                <w:rFonts w:ascii="Ubuntu" w:hAnsi="Ubuntu"/>
+                <w:noProof/>
+                <w:lang w:val="en-IN"/>
+              </w:rPr>
+              <w:t>4.5</w:t>
+            </w:r>
+            <w:r>
+              <w:rPr>
+                <w:rStyle w:val="Hyperlink"/>
+                <w:noProof/>
+                <w:lang w:val="en-IN"/>
+              </w:rPr>
+              <w:t xml:space="preserve"> Length of the longest subarray with zero Sum</w:t>
+            </w:r>
+            <w:r>
+              <w:rPr>
+                <w:noProof/>
+                <w:webHidden/>
+              </w:rPr>
+              <w:tab/>
+            </w:r>
+            <w:r>
+              <w:rPr>
+                <w:noProof/>
+                <w:webHidden/>
+              </w:rPr>
+              <w:fldChar w:fldCharType="begin"/>
+            </w:r>
+            <w:r>
+              <w:rPr>
+                <w:noProof/>
+                <w:webHidden/>
+              </w:rPr>
+              <w:instrText xml:space="preserve"> PAGEREF _Toc224137459 \h </w:instrText>
+            </w:r>
+            <w:r>
+              <w:rPr>
+                <w:noProof/>
+                <w:webHidden/>
+              </w:rPr>
+            </w:r>
+            <w:r>
+              <w:rPr>
+                <w:noProof/>
+                <w:webHidden/>
+              </w:rPr>
+              <w:fldChar w:fldCharType="separate"/>
+            </w:r>
+            <w:r>
+              <w:rPr>
+                <w:noProof/>
+                <w:webHidden/>
+              </w:rPr>
+              <w:t>34</w:t>
+            </w:r>
+            <w:r>
+              <w:rPr>
+                <w:noProof/>
+                <w:webHidden/>
+              </w:rPr>
+              <w:fldChar w:fldCharType="end"/>
+            </w:r>
+          </w:hyperlink>
+        </w:p>
+        <w:p>
+          <w:pPr>
+            <w:pStyle w:val="TOC3"/>
+            <w:tabs>
+              <w:tab w:val="right" w:leader="dot" w:pos="9350"/>
+            </w:tabs>
+            <w:rPr>
+              <w:rFonts w:asciiTheme="minorHAnsi" w:eastAsiaTheme="minorEastAsia" w:hAnsiTheme="minorHAnsi" w:cstheme="minorBidi"/>
+              <w:noProof/>
+              <w:kern w:val="2"/>
+              <w:sz w:val="24"/>
+              <w:szCs w:val="24"/>
+              <w14:ligatures w14:val="standardContextual"/>
+            </w:rPr>
+          </w:pPr>
+          <w:hyperlink w:anchor="_Toc224137460" w:history="1">
+            <w:r>
+              <w:rPr>
+                <w:rStyle w:val="Hyperlink"/>
+                <w:rFonts w:ascii="Ubuntu" w:hAnsi="Ubuntu"/>
+                <w:noProof/>
+                <w:lang w:val="en-IN"/>
+              </w:rPr>
+              <w:t>4.6</w:t>
+            </w:r>
+            <w:r>
+              <w:rPr>
+                <w:rStyle w:val="Hyperlink"/>
+                <w:noProof/>
+                <w:lang w:val="en-IN"/>
+              </w:rPr>
+              <w:t xml:space="preserve"> Count the number of subarrays with given xor K</w:t>
+            </w:r>
+            <w:r>
+              <w:rPr>
+                <w:noProof/>
+                <w:webHidden/>
+              </w:rPr>
+              <w:tab/>
+            </w:r>
+            <w:r>
+              <w:rPr>
+                <w:noProof/>
+                <w:webHidden/>
+              </w:rPr>
+              <w:fldChar w:fldCharType="begin"/>
+            </w:r>
+            <w:r>
+              <w:rPr>
+                <w:noProof/>
+                <w:webHidden/>
+              </w:rPr>
+              <w:instrText xml:space="preserve"> PAGEREF _Toc224137460 \h </w:instrText>
+            </w:r>
+            <w:r>
+              <w:rPr>
+                <w:noProof/>
+                <w:webHidden/>
+              </w:rPr>
+            </w:r>
+            <w:r>
+              <w:rPr>
+                <w:noProof/>
+                <w:webHidden/>
+              </w:rPr>
+              <w:fldChar w:fldCharType="separate"/>
+            </w:r>
+            <w:r>
+              <w:rPr>
+                <w:noProof/>
+                <w:webHidden/>
+              </w:rPr>
+              <w:t>36</w:t>
+            </w:r>
+            <w:r>
+              <w:rPr>
+                <w:noProof/>
+                <w:webHidden/>
+              </w:rPr>
+              <w:fldChar w:fldCharType="end"/>
+            </w:r>
+          </w:hyperlink>
+        </w:p>
+        <w:p>
+          <w:pPr>
+            <w:pStyle w:val="TOC3"/>
+            <w:tabs>
+              <w:tab w:val="right" w:leader="dot" w:pos="9350"/>
+            </w:tabs>
+            <w:rPr>
+              <w:rFonts w:asciiTheme="minorHAnsi" w:eastAsiaTheme="minorEastAsia" w:hAnsiTheme="minorHAnsi" w:cstheme="minorBidi"/>
+              <w:noProof/>
+              <w:kern w:val="2"/>
+              <w:sz w:val="24"/>
+              <w:szCs w:val="24"/>
+              <w14:ligatures w14:val="standardContextual"/>
+            </w:rPr>
+          </w:pPr>
+          <w:hyperlink w:anchor="_Toc224137461" w:history="1">
+            <w:r>
+              <w:rPr>
+                <w:rStyle w:val="Hyperlink"/>
+                <w:rFonts w:ascii="Ubuntu" w:hAnsi="Ubuntu"/>
+                <w:noProof/>
+                <w:lang w:val="en-IN"/>
+              </w:rPr>
+              <w:t>4.7</w:t>
+            </w:r>
+            <w:r>
+              <w:rPr>
+                <w:rStyle w:val="Hyperlink"/>
+                <w:noProof/>
+                <w:lang w:val="en-IN"/>
+              </w:rPr>
+              <w:t xml:space="preserve"> Longest Substring Without Repeating Characters</w:t>
+            </w:r>
+            <w:r>
+              <w:rPr>
+                <w:noProof/>
+                <w:webHidden/>
+              </w:rPr>
+              <w:tab/>
+            </w:r>
+            <w:r>
+              <w:rPr>
+                <w:noProof/>
+                <w:webHidden/>
+              </w:rPr>
+              <w:fldChar w:fldCharType="begin"/>
+            </w:r>
+            <w:r>
+              <w:rPr>
+                <w:noProof/>
+                <w:webHidden/>
+              </w:rPr>
+              <w:instrText xml:space="preserve"> PAGEREF _Toc224137461 \h </w:instrText>
+            </w:r>
+            <w:r>
+              <w:rPr>
+                <w:noProof/>
+                <w:webHidden/>
+              </w:rPr>
+            </w:r>
+            <w:r>
+              <w:rPr>
+                <w:noProof/>
+                <w:webHidden/>
+              </w:rPr>
+              <w:fldChar w:fldCharType="separate"/>
+            </w:r>
+            <w:r>
+              <w:rPr>
+                <w:noProof/>
+                <w:webHidden/>
+              </w:rPr>
+              <w:t>38</w:t>
+            </w:r>
+            <w:r>
+              <w:rPr>
+                <w:noProof/>
+                <w:webHidden/>
+              </w:rPr>
+              <w:fldChar w:fldCharType="end"/>
+            </w:r>
+          </w:hyperlink>
+        </w:p>
+        <w:p>
+          <w:pPr>
+            <w:pStyle w:val="TOC3"/>
+            <w:tabs>
+              <w:tab w:val="right" w:leader="dot" w:pos="9350"/>
+            </w:tabs>
+            <w:rPr>
+              <w:rFonts w:asciiTheme="minorHAnsi" w:eastAsiaTheme="minorEastAsia" w:hAnsiTheme="minorHAnsi" w:cstheme="minorBidi"/>
+              <w:noProof/>
+              <w:kern w:val="2"/>
+              <w:sz w:val="24"/>
+              <w:szCs w:val="24"/>
+              <w14:ligatures w14:val="standardContextual"/>
+            </w:rPr>
+          </w:pPr>
+          <w:hyperlink w:anchor="_Toc224137462" w:history="1">
+            <w:r>
+              <w:rPr>
+                <w:rStyle w:val="Hyperlink"/>
+                <w:rFonts w:ascii="Ubuntu" w:hAnsi="Ubuntu"/>
+                <w:noProof/>
+                <w:lang w:val="en-IN"/>
+              </w:rPr>
+              <w:t>4.8</w:t>
+            </w:r>
+            <w:r>
+              <w:rPr>
+                <w:rStyle w:val="Hyperlink"/>
+                <w:noProof/>
+                <w:lang w:val="en-IN"/>
+              </w:rPr>
+              <w:t xml:space="preserve"> Trapping Rainwater</w:t>
+            </w:r>
+            <w:r>
+              <w:rPr>
+                <w:noProof/>
+                <w:webHidden/>
+              </w:rPr>
+              <w:tab/>
+            </w:r>
+            <w:r>
+              <w:rPr>
+                <w:noProof/>
+                <w:webHidden/>
+              </w:rPr>
+              <w:fldChar w:fldCharType="begin"/>
+            </w:r>
+            <w:r>
+              <w:rPr>
+                <w:noProof/>
+                <w:webHidden/>
+              </w:rPr>
+              <w:instrText xml:space="preserve"> PAGEREF _Toc224137462 \h </w:instrText>
+            </w:r>
+            <w:r>
+              <w:rPr>
+                <w:noProof/>
+                <w:webHidden/>
+              </w:rPr>
+            </w:r>
+            <w:r>
+              <w:rPr>
+                <w:noProof/>
+                <w:webHidden/>
+              </w:rPr>
+              <w:fldChar w:fldCharType="separate"/>
+            </w:r>
+            <w:r>
+              <w:rPr>
+                <w:noProof/>
+                <w:webHidden/>
+              </w:rPr>
+              <w:t>41</w:t>
+            </w:r>
+            <w:r>
+              <w:rPr>
+                <w:noProof/>
+                <w:webHidden/>
+              </w:rPr>
+              <w:fldChar w:fldCharType="end"/>
+            </w:r>
+          </w:hyperlink>
+        </w:p>
+        <w:p>
+          <w:pPr>
+            <w:pStyle w:val="TOC3"/>
+            <w:tabs>
+              <w:tab w:val="right" w:leader="dot" w:pos="9350"/>
+            </w:tabs>
+            <w:rPr>
+              <w:rFonts w:asciiTheme="minorHAnsi" w:eastAsiaTheme="minorEastAsia" w:hAnsiTheme="minorHAnsi" w:cstheme="minorBidi"/>
+              <w:noProof/>
+              <w:kern w:val="2"/>
+              <w:sz w:val="24"/>
+              <w:szCs w:val="24"/>
+              <w14:ligatures w14:val="standardContextual"/>
+            </w:rPr>
+          </w:pPr>
+          <w:hyperlink w:anchor="_Toc224137463" w:history="1">
+            <w:r>
+              <w:rPr>
+                <w:rStyle w:val="Hyperlink"/>
+                <w:rFonts w:ascii="Ubuntu" w:hAnsi="Ubuntu"/>
+                <w:noProof/>
+              </w:rPr>
+              <w:t>4.9</w:t>
+            </w:r>
+            <w:r>
+              <w:rPr>
+                <w:rStyle w:val="Hyperlink"/>
+                <w:noProof/>
+              </w:rPr>
+              <w:t xml:space="preserve"> Remove Duplicates in-place from Sorted Array</w:t>
+            </w:r>
+            <w:r>
+              <w:rPr>
+                <w:noProof/>
+                <w:webHidden/>
+              </w:rPr>
+              <w:tab/>
+            </w:r>
+            <w:r>
+              <w:rPr>
+                <w:noProof/>
+                <w:webHidden/>
+              </w:rPr>
+              <w:fldChar w:fldCharType="begin"/>
+            </w:r>
+            <w:r>
+              <w:rPr>
+                <w:noProof/>
+                <w:webHidden/>
+              </w:rPr>
+              <w:instrText xml:space="preserve"> PAGEREF _Toc224137463 \h </w:instrText>
+            </w:r>
+            <w:r>
+              <w:rPr>
+                <w:noProof/>
+                <w:webHidden/>
+              </w:rPr>
+            </w:r>
+            <w:r>
+              <w:rPr>
+                <w:noProof/>
+                <w:webHidden/>
+              </w:rPr>
+              <w:fldChar w:fldCharType="separate"/>
+            </w:r>
+            <w:r>
+              <w:rPr>
+                <w:noProof/>
+                <w:webHidden/>
+              </w:rPr>
+              <w:t>42</w:t>
+            </w:r>
+            <w:r>
+              <w:rPr>
+                <w:noProof/>
+                <w:webHidden/>
+              </w:rPr>
+              <w:fldChar w:fldCharType="end"/>
+            </w:r>
+          </w:hyperlink>
+        </w:p>
+        <w:p>
           <w:r>
             <w:rPr>
               <w:b/>
@@ -3049,7 +2628,7 @@
           <w:szCs w:val="28"/>
         </w:rPr>
       </w:pPr>
-      <w:bookmarkStart w:id="0" w:name="_Toc125491502"/>
+      <w:bookmarkStart w:id="0" w:name="_Toc224137433"/>
       <w:r>
         <w:rPr>
           <w:sz w:val="28"/>
@@ -3074,7 +2653,7 @@
           <w:lang w:val="en-IN"/>
         </w:rPr>
       </w:pPr>
-      <w:bookmarkStart w:id="1" w:name="_Toc125491503"/>
+      <w:bookmarkStart w:id="1" w:name="_Toc224137434"/>
       <w:r>
         <w:rPr>
           <w:szCs w:val="28"/>
@@ -3942,7 +3521,7 @@
           <w:lang w:val="en-IN"/>
         </w:rPr>
       </w:pPr>
-      <w:bookmarkStart w:id="2" w:name="_Toc125491504"/>
+      <w:bookmarkStart w:id="2" w:name="_Toc224137435"/>
       <w:r>
         <w:rPr>
           <w:szCs w:val="28"/>
@@ -5490,7 +5069,7 @@
           <w:lang w:val="en-IN"/>
         </w:rPr>
       </w:pPr>
-      <w:bookmarkStart w:id="3" w:name="_Toc125491505"/>
+      <w:bookmarkStart w:id="3" w:name="_Toc224137436"/>
       <w:r>
         <w:rPr>
           <w:szCs w:val="28"/>
@@ -6252,7 +5831,7 @@
           <w:szCs w:val="28"/>
         </w:rPr>
       </w:pPr>
-      <w:bookmarkStart w:id="5" w:name="_Toc125491506"/>
+      <w:bookmarkStart w:id="5" w:name="_Toc224137437"/>
       <w:proofErr w:type="spellStart"/>
       <w:r>
         <w:rPr>
@@ -8190,7 +7769,7 @@
           <w:szCs w:val="28"/>
         </w:rPr>
       </w:pPr>
-      <w:bookmarkStart w:id="6" w:name="_Toc125491507"/>
+      <w:bookmarkStart w:id="6" w:name="_Toc224137438"/>
       <w:r>
         <w:rPr>
           <w:szCs w:val="28"/>
@@ -9071,7 +8650,7 @@
           <w:szCs w:val="28"/>
         </w:rPr>
       </w:pPr>
-      <w:bookmarkStart w:id="7" w:name="_Toc125491508"/>
+      <w:bookmarkStart w:id="7" w:name="_Toc224137439"/>
       <w:r>
         <w:rPr>
           <w:szCs w:val="28"/>
@@ -9327,7 +8906,7 @@
           <w:szCs w:val="28"/>
         </w:rPr>
       </w:pPr>
-      <w:bookmarkStart w:id="8" w:name="_Toc125491509"/>
+      <w:bookmarkStart w:id="8" w:name="_Toc224137440"/>
       <w:r>
         <w:rPr>
           <w:sz w:val="28"/>
@@ -9345,7 +8924,7 @@
           <w:lang w:val="en-IN"/>
         </w:rPr>
       </w:pPr>
-      <w:bookmarkStart w:id="9" w:name="_Toc125491510"/>
+      <w:bookmarkStart w:id="9" w:name="_Toc224137441"/>
       <w:r>
         <w:rPr>
           <w:szCs w:val="28"/>
@@ -9520,7 +9099,7 @@
           <w:lang w:val="en-IN"/>
         </w:rPr>
       </w:pPr>
-      <w:bookmarkStart w:id="10" w:name="_Toc125491511"/>
+      <w:bookmarkStart w:id="10" w:name="_Toc224137442"/>
       <w:r>
         <w:rPr>
           <w:szCs w:val="28"/>
@@ -10440,7 +10019,7 @@
           <w:lang w:val="en-IN"/>
         </w:rPr>
       </w:pPr>
-      <w:bookmarkStart w:id="11" w:name="_Toc125491512"/>
+      <w:bookmarkStart w:id="11" w:name="_Toc224137443"/>
       <w:r>
         <w:rPr>
           <w:szCs w:val="28"/>
@@ -11506,7 +11085,7 @@
           <w:noProof/>
         </w:rPr>
         <w:drawing>
-          <wp:inline distT="0" distB="0" distL="0" distR="0" wp14:anchorId="655250CC" wp14:editId="2D08144D">
+          <wp:inline distT="0" distB="0" distL="0" distR="0" wp14:anchorId="655250CC" wp14:editId="6A34D247">
             <wp:extent cx="5943600" cy="3422650"/>
             <wp:effectExtent l="0" t="0" r="0" b="6350"/>
             <wp:docPr id="2034329436" name="Picture 1"/>
@@ -12303,7 +11882,7 @@
           <w:lang w:val="en-IN"/>
         </w:rPr>
       </w:pPr>
-      <w:bookmarkStart w:id="12" w:name="_Toc125491513"/>
+      <w:bookmarkStart w:id="12" w:name="_Toc224137444"/>
       <w:r>
         <w:rPr>
           <w:szCs w:val="28"/>
@@ -13292,7 +12871,7 @@
           <w:lang w:val="en-IN"/>
         </w:rPr>
       </w:pPr>
-      <w:bookmarkStart w:id="13" w:name="_Toc125491514"/>
+      <w:bookmarkStart w:id="13" w:name="_Toc224137445"/>
       <w:r>
         <w:rPr>
           <w:szCs w:val="28"/>
@@ -15185,7 +14764,7 @@
           <w:lang w:val="en-IN"/>
         </w:rPr>
       </w:pPr>
-      <w:bookmarkStart w:id="14" w:name="_Toc125491515"/>
+      <w:bookmarkStart w:id="14" w:name="_Toc224137446"/>
       <w:r>
         <w:rPr>
           <w:szCs w:val="28"/>
@@ -16228,7 +15807,7 @@
           <w:szCs w:val="28"/>
         </w:rPr>
       </w:pPr>
-      <w:bookmarkStart w:id="15" w:name="_Toc125491516"/>
+      <w:bookmarkStart w:id="15" w:name="_Toc224137447"/>
       <w:r>
         <w:rPr>
           <w:sz w:val="28"/>
@@ -16246,7 +15825,7 @@
           <w:szCs w:val="28"/>
         </w:rPr>
       </w:pPr>
-      <w:bookmarkStart w:id="16" w:name="_Toc125491517"/>
+      <w:bookmarkStart w:id="16" w:name="_Toc224137448"/>
       <w:r>
         <w:rPr>
           <w:szCs w:val="28"/>
@@ -17075,7 +16654,7 @@
           <w:lang w:val="en-IN"/>
         </w:rPr>
       </w:pPr>
-      <w:bookmarkStart w:id="17" w:name="_Toc125491518"/>
+      <w:bookmarkStart w:id="17" w:name="_Toc224137449"/>
       <w:r>
         <w:rPr>
           <w:szCs w:val="28"/>
@@ -17422,7 +17001,7 @@
           <w:lang w:val="en-IN"/>
         </w:rPr>
       </w:pPr>
-      <w:bookmarkStart w:id="18" w:name="_Toc125491519"/>
+      <w:bookmarkStart w:id="18" w:name="_Toc224137450"/>
       <w:r>
         <w:rPr>
           <w:szCs w:val="28"/>
@@ -17810,7 +17389,7 @@
           <w:lang w:val="en-IN"/>
         </w:rPr>
       </w:pPr>
-      <w:bookmarkStart w:id="19" w:name="_Toc125491520"/>
+      <w:bookmarkStart w:id="19" w:name="_Toc224137451"/>
       <w:r>
         <w:rPr>
           <w:szCs w:val="28"/>
@@ -18016,7 +17595,7 @@
           <w:lang w:val="en-IN"/>
         </w:rPr>
       </w:pPr>
-      <w:bookmarkStart w:id="20" w:name="_Toc125491521"/>
+      <w:bookmarkStart w:id="20" w:name="_Toc224137452"/>
       <w:r>
         <w:rPr>
           <w:szCs w:val="28"/>
@@ -18592,7 +18171,7 @@
           <w:lang w:val="en-IN"/>
         </w:rPr>
       </w:pPr>
-      <w:bookmarkStart w:id="21" w:name="_Toc125491522"/>
+      <w:bookmarkStart w:id="21" w:name="_Toc224137453"/>
       <w:r>
         <w:rPr>
           <w:szCs w:val="28"/>
@@ -19982,7 +19561,7 @@
           <w:szCs w:val="28"/>
         </w:rPr>
       </w:pPr>
-      <w:bookmarkStart w:id="22" w:name="_Toc125491523"/>
+      <w:bookmarkStart w:id="22" w:name="_Toc224137454"/>
       <w:r>
         <w:rPr>
           <w:sz w:val="28"/>
@@ -20000,7 +19579,7 @@
           <w:lang w:val="en-IN"/>
         </w:rPr>
       </w:pPr>
-      <w:bookmarkStart w:id="23" w:name="_Toc125491524"/>
+      <w:bookmarkStart w:id="23" w:name="_Toc224137455"/>
       <w:r>
         <w:rPr>
           <w:szCs w:val="28"/>
@@ -20771,7 +20350,7 @@
           <w:szCs w:val="28"/>
         </w:rPr>
       </w:pPr>
-      <w:bookmarkStart w:id="24" w:name="_Toc125491525"/>
+      <w:bookmarkStart w:id="24" w:name="_Toc224137456"/>
       <w:r>
         <w:rPr>
           <w:szCs w:val="28"/>
@@ -21321,7 +20900,7 @@
           <w:szCs w:val="28"/>
         </w:rPr>
       </w:pPr>
-      <w:bookmarkStart w:id="25" w:name="_Toc125491526"/>
+      <w:bookmarkStart w:id="25" w:name="_Toc224137457"/>
       <w:r>
         <w:rPr>
           <w:szCs w:val="28"/>
@@ -22282,7 +21861,7 @@
           <w:szCs w:val="28"/>
         </w:rPr>
       </w:pPr>
-      <w:bookmarkStart w:id="26" w:name="_Toc125491527"/>
+      <w:bookmarkStart w:id="26" w:name="_Toc224137458"/>
       <w:r>
         <w:rPr>
           <w:szCs w:val="28"/>
@@ -22752,7 +22331,7 @@
           <w:lang w:val="en-IN"/>
         </w:rPr>
       </w:pPr>
-      <w:bookmarkStart w:id="27" w:name="_Toc125491528"/>
+      <w:bookmarkStart w:id="27" w:name="_Toc224137459"/>
       <w:r>
         <w:rPr>
           <w:szCs w:val="28"/>
@@ -23543,7 +23122,7 @@
           <w:lang w:val="en-IN"/>
         </w:rPr>
       </w:pPr>
-      <w:bookmarkStart w:id="28" w:name="_Toc125491529"/>
+      <w:bookmarkStart w:id="28" w:name="_Toc224137460"/>
       <w:r>
         <w:rPr>
           <w:szCs w:val="28"/>
@@ -25009,7 +24588,7 @@
           <w:lang w:val="en-IN"/>
         </w:rPr>
       </w:pPr>
-      <w:bookmarkStart w:id="29" w:name="_Toc125491530"/>
+      <w:bookmarkStart w:id="29" w:name="_Toc224137461"/>
       <w:r>
         <w:rPr>
           <w:szCs w:val="28"/>
@@ -25871,6 +25450,7 @@
           <w:lang w:val="en-IN"/>
         </w:rPr>
       </w:pPr>
+      <w:bookmarkStart w:id="30" w:name="_Toc224137462"/>
       <w:r>
         <w:rPr>
           <w:lang w:val="en-IN"/>
@@ -25878,13 +25458,11 @@
         <w:lastRenderedPageBreak/>
         <w:t>Trapping Rainwater</w:t>
       </w:r>
-    </w:p>
-    <w:p>
-      <w:r>
-        <w:t xml:space="preserve">Given an array of non-negative integers representation elevation of ground. Your task is to find the water that can be trapped after </w:t>
-      </w:r>
-      <w:r>
-        <w:t>rain.</w:t>
+      <w:bookmarkEnd w:id="30"/>
+    </w:p>
+    <w:p>
+      <w:r>
+        <w:t>Given an array of non-negative integers representation elevation of ground. Your task is to find the water that can be trapped after rain.</w:t>
       </w:r>
     </w:p>
     <w:p>
@@ -26531,11 +26109,399 @@
     </w:p>
     <w:p>
       <w:pPr>
-        <w:rPr>
-          <w:lang w:val="en-IN"/>
-        </w:rPr>
-      </w:pPr>
-    </w:p>
+        <w:pStyle w:val="Heading3"/>
+      </w:pPr>
+      <w:bookmarkStart w:id="31" w:name="_Toc224137463"/>
+      <w:r>
+        <w:t>Remove Duplicates in-place from Sorted Array</w:t>
+      </w:r>
+      <w:bookmarkEnd w:id="31"/>
+    </w:p>
+    <w:p>
+      <w:r>
+        <w:t xml:space="preserve">Given an integer array sorted in non-decreasing order, remove the duplicates in place such that each unique element appears only once. The relative order of the elements should be kept the </w:t>
+      </w:r>
+      <w:r>
+        <w:t>same. If</w:t>
+      </w:r>
+      <w:r>
+        <w:t xml:space="preserve"> there are k elements after removing the duplicates, then the first k elements of the array should hold </w:t>
+      </w:r>
+      <w:proofErr w:type="gramStart"/>
+      <w:r>
+        <w:t>the final result</w:t>
+      </w:r>
+      <w:proofErr w:type="gramEnd"/>
+      <w:r>
+        <w:t>. It does not matter what you leave beyond the first k elements.</w:t>
+      </w:r>
+    </w:p>
+    <w:p>
+      <w:r>
+        <w:t xml:space="preserve">Input: </w:t>
+      </w:r>
+      <w:proofErr w:type="spellStart"/>
+      <w:proofErr w:type="gramStart"/>
+      <w:r>
+        <w:t>arr</w:t>
+      </w:r>
+      <w:proofErr w:type="spellEnd"/>
+      <w:r>
+        <w:t>[</w:t>
+      </w:r>
+      <w:proofErr w:type="gramEnd"/>
+      <w:r>
+        <w:t>]</w:t>
+      </w:r>
+      <w:proofErr w:type="gramStart"/>
+      <w:r>
+        <w:t>=[</w:t>
+      </w:r>
+      <w:proofErr w:type="gramEnd"/>
+      <w:r>
+        <w:t>1,1,2,2,2,3,3]</w:t>
+      </w:r>
+    </w:p>
+    <w:p>
+      <w:r>
+        <w:t>Output: [1,2,</w:t>
+      </w:r>
+      <w:proofErr w:type="gramStart"/>
+      <w:r>
+        <w:t>3,_</w:t>
+      </w:r>
+      <w:proofErr w:type="gramEnd"/>
+      <w:r>
+        <w:t>,</w:t>
+      </w:r>
+      <w:proofErr w:type="gramStart"/>
+      <w:r>
+        <w:t>_,_</w:t>
+      </w:r>
+      <w:proofErr w:type="gramEnd"/>
+      <w:r>
+        <w:t>,_]</w:t>
+      </w:r>
+    </w:p>
+    <w:p>
+      <w:r>
+        <w:t xml:space="preserve">Explanation: Total number of unique elements are 3, </w:t>
+      </w:r>
+      <w:proofErr w:type="spellStart"/>
+      <w:r>
+        <w:t>i.e</w:t>
+      </w:r>
+      <w:proofErr w:type="spellEnd"/>
+      <w:r>
+        <w:t xml:space="preserve">[1,2,3] and </w:t>
+      </w:r>
+      <w:r>
+        <w:t>therefore</w:t>
+      </w:r>
+      <w:r>
+        <w:t xml:space="preserve"> return 3 after assigning [1,2,3] in the beginning of the array.</w:t>
+      </w:r>
+    </w:p>
+    <w:p>
+      <w:r>
+        <w:t xml:space="preserve">Input: </w:t>
+      </w:r>
+      <w:proofErr w:type="spellStart"/>
+      <w:proofErr w:type="gramStart"/>
+      <w:r>
+        <w:t>arr</w:t>
+      </w:r>
+      <w:proofErr w:type="spellEnd"/>
+      <w:r>
+        <w:t>[</w:t>
+      </w:r>
+      <w:proofErr w:type="gramEnd"/>
+      <w:r>
+        <w:t>]</w:t>
+      </w:r>
+      <w:proofErr w:type="gramStart"/>
+      <w:r>
+        <w:t>=[</w:t>
+      </w:r>
+      <w:proofErr w:type="gramEnd"/>
+      <w:r>
+        <w:t>1,1,1,2,2,3,3,3,3,4,4]</w:t>
+      </w:r>
+    </w:p>
+    <w:p>
+      <w:r>
+        <w:lastRenderedPageBreak/>
+        <w:t>Output: [1,2,3,</w:t>
+      </w:r>
+      <w:proofErr w:type="gramStart"/>
+      <w:r>
+        <w:t>4,_</w:t>
+      </w:r>
+      <w:proofErr w:type="gramEnd"/>
+      <w:r>
+        <w:t>,</w:t>
+      </w:r>
+      <w:proofErr w:type="gramStart"/>
+      <w:r>
+        <w:t>_,_</w:t>
+      </w:r>
+      <w:proofErr w:type="gramEnd"/>
+      <w:r>
+        <w:t>,</w:t>
+      </w:r>
+      <w:proofErr w:type="gramStart"/>
+      <w:r>
+        <w:t>_,_</w:t>
+      </w:r>
+      <w:proofErr w:type="gramEnd"/>
+      <w:r>
+        <w:t>,</w:t>
+      </w:r>
+      <w:proofErr w:type="gramStart"/>
+      <w:r>
+        <w:t>_,_</w:t>
+      </w:r>
+      <w:proofErr w:type="gramEnd"/>
+      <w:r>
+        <w:t>]</w:t>
+      </w:r>
+    </w:p>
+    <w:p>
+      <w:r>
+        <w:t xml:space="preserve">Explanation: Total number of unique elements are 4, </w:t>
+      </w:r>
+      <w:proofErr w:type="spellStart"/>
+      <w:r>
+        <w:t>i.e</w:t>
+      </w:r>
+      <w:proofErr w:type="spellEnd"/>
+      <w:r>
+        <w:t xml:space="preserve">[1,2,3,4] and </w:t>
+      </w:r>
+      <w:r>
+        <w:t>therefore</w:t>
+      </w:r>
+      <w:r>
+        <w:t xml:space="preserve"> return 4 after assigning [1,2,3,4] in the beginning of the array.</w:t>
+      </w:r>
+    </w:p>
+    <w:p>
+      <w:pPr>
+        <w:rPr>
+          <w:u w:val="single"/>
+          <w:lang w:val="en-IN"/>
+        </w:rPr>
+      </w:pPr>
+      <w:r>
+        <w:rPr>
+          <w:u w:val="single"/>
+          <w:lang w:val="en-IN"/>
+        </w:rPr>
+        <w:t>Brute Force :</w:t>
+      </w:r>
+    </w:p>
+    <w:p>
+      <w:r>
+        <w:t xml:space="preserve">Maintain a set </w:t>
+      </w:r>
+      <w:r>
+        <w:t xml:space="preserve">, and iterate the array through each element , if it is already exists in the set , then it’s a duplicate we don’t want to </w:t>
+      </w:r>
+      <w:r>
+        <w:t xml:space="preserve">put that element in the </w:t>
+      </w:r>
+      <w:r>
+        <w:t>at</w:t>
+      </w:r>
+      <w:r>
+        <w:t xml:space="preserve"> the</w:t>
+      </w:r>
+      <w:r>
+        <w:t xml:space="preserve"> beginning of</w:t>
+      </w:r>
+      <w:r>
+        <w:t xml:space="preserve"> array when we are building one , otherwise it is not a duplicate and </w:t>
+      </w:r>
+      <w:r>
+        <w:t xml:space="preserve">we need to put this in the </w:t>
+      </w:r>
+      <w:r>
+        <w:t xml:space="preserve">array at beginning </w:t>
+      </w:r>
+      <w:r>
+        <w:t>and also in the set to avoid processing that in the next time.</w:t>
+      </w:r>
+    </w:p>
+    <w:p>
+      <w:r>
+        <w:rPr>
+          <w:b/>
+          <w:bCs/>
+        </w:rPr>
+        <w:t>Time Complexity: O(N)</w:t>
+      </w:r>
+      <w:r>
+        <w:t>, We traverse the entire array and insert elements into set.</w:t>
+      </w:r>
+    </w:p>
+    <w:p>
+      <w:r>
+        <w:rPr>
+          <w:b/>
+          <w:bCs/>
+        </w:rPr>
+        <w:t>Space Complexity: O(N)</w:t>
+      </w:r>
+      <w:r>
+        <w:t>, additional space used to store elements in set.</w:t>
+      </w:r>
+    </w:p>
+    <w:p>
+      <w:pPr>
+        <w:rPr>
+          <w:u w:val="single"/>
+        </w:rPr>
+      </w:pPr>
+      <w:r>
+        <w:rPr>
+          <w:u w:val="single"/>
+        </w:rPr>
+        <w:t xml:space="preserve">Best </w:t>
+      </w:r>
+      <w:r>
+        <w:rPr>
+          <w:u w:val="single"/>
+        </w:rPr>
+        <w:t>Approach:</w:t>
+      </w:r>
+      <w:r>
+        <w:rPr>
+          <w:u w:val="single"/>
+        </w:rPr>
+        <w:t xml:space="preserve"> </w:t>
+      </w:r>
+    </w:p>
+    <w:p>
+      <w:r>
+        <w:t xml:space="preserve">Since the array is sorted, we know that all the duplicate values will be adjacent to each </w:t>
+      </w:r>
+      <w:r>
+        <w:t>other,</w:t>
+      </w:r>
+      <w:r>
+        <w:t xml:space="preserve"> we can check </w:t>
+      </w:r>
+      <w:proofErr w:type="spellStart"/>
+      <w:r>
+        <w:t>nums</w:t>
+      </w:r>
+      <w:proofErr w:type="spellEnd"/>
+      <w:r>
+        <w:t>[</w:t>
+      </w:r>
+      <w:proofErr w:type="spellStart"/>
+      <w:r>
+        <w:t>i</w:t>
+      </w:r>
+      <w:proofErr w:type="spellEnd"/>
+      <w:proofErr w:type="gramStart"/>
+      <w:r>
+        <w:t>] !</w:t>
+      </w:r>
+      <w:proofErr w:type="gramEnd"/>
+      <w:r>
+        <w:t xml:space="preserve">= </w:t>
+      </w:r>
+      <w:proofErr w:type="spellStart"/>
+      <w:r>
+        <w:t>nums</w:t>
+      </w:r>
+      <w:proofErr w:type="spellEnd"/>
+      <w:r>
+        <w:t>[i-1</w:t>
+      </w:r>
+      <w:proofErr w:type="gramStart"/>
+      <w:r>
+        <w:t>]  ,</w:t>
+      </w:r>
+      <w:proofErr w:type="gramEnd"/>
+      <w:r>
+        <w:t xml:space="preserve"> then we can put </w:t>
+      </w:r>
+      <w:proofErr w:type="spellStart"/>
+      <w:r>
+        <w:t>nums</w:t>
+      </w:r>
+      <w:proofErr w:type="spellEnd"/>
+      <w:r>
+        <w:t>[i-1] at the beginning of the array.</w:t>
+      </w:r>
+    </w:p>
+    <w:p>
+      <w:r>
+        <w:t xml:space="preserve">At </w:t>
+      </w:r>
+      <w:r>
+        <w:t>last,</w:t>
+      </w:r>
+      <w:r>
+        <w:t xml:space="preserve"> we need to put last element in the array </w:t>
+      </w:r>
+      <w:r>
+        <w:t>always,</w:t>
+      </w:r>
+      <w:r>
+        <w:t xml:space="preserve"> no matter </w:t>
+      </w:r>
+      <w:r>
+        <w:t>what,</w:t>
+      </w:r>
+      <w:r>
+        <w:t xml:space="preserve"> because that is always going to be unique if we put.</w:t>
+      </w:r>
+    </w:p>
+    <w:p>
+      <w:r>
+        <w:rPr>
+          <w:b/>
+          <w:bCs/>
+        </w:rPr>
+        <w:t>Time Complexity: O(N)</w:t>
+      </w:r>
+      <w:r>
+        <w:t>, We traverse the entire original array only once.</w:t>
+      </w:r>
+      <w:r>
+        <w:br/>
+      </w:r>
+      <w:r>
+        <w:rPr>
+          <w:b/>
+          <w:bCs/>
+        </w:rPr>
+        <w:t xml:space="preserve">Space Complexity: </w:t>
+      </w:r>
+      <w:proofErr w:type="gramStart"/>
+      <w:r>
+        <w:rPr>
+          <w:b/>
+          <w:bCs/>
+        </w:rPr>
+        <w:t>O(</w:t>
+      </w:r>
+      <w:proofErr w:type="gramEnd"/>
+      <w:r>
+        <w:rPr>
+          <w:b/>
+          <w:bCs/>
+        </w:rPr>
+        <w:t>1)</w:t>
+      </w:r>
+      <w:r>
+        <w:t>, constant additional space is used to check unique elements.</w:t>
+      </w:r>
+    </w:p>
+    <w:p/>
     <w:sectPr>
       <w:pgSz w:w="12240" w:h="15840"/>
       <w:pgMar w:top="1440" w:right="1440" w:bottom="1440" w:left="1440" w:header="720" w:footer="720" w:gutter="0"/>
@@ -30505,7 +30471,7 @@
   <w:style w:type="paragraph" w:default="1" w:styleId="Normal">
     <w:name w:val="Normal"/>
     <w:qFormat/>
-    <w:rsid w:val="00664ED0"/>
+    <w:rsid w:val="00AC52FB"/>
     <w:rPr>
       <w:rFonts w:ascii="Arial" w:hAnsi="Arial"/>
     </w:rPr>

</xml_diff>

<commit_message>
find max consecutive ones
</commit_message>
<xml_diff>
--- a/DSA/JavaStriverDSA/Arrays/StriverSDESheet_Arrays.docx
+++ b/DSA/JavaStriverDSA/Arrays/StriverSDESheet_Arrays.docx
@@ -67,7 +67,7 @@
           <w:r>
             <w:fldChar w:fldCharType="separate"/>
           </w:r>
-          <w:hyperlink w:anchor="_Toc224137433" w:history="1">
+          <w:hyperlink w:anchor="_Toc224142892" w:history="1">
             <w:r>
               <w:rPr>
                 <w:rStyle w:val="Hyperlink"/>
@@ -102,7 +102,7 @@
                 <w:noProof/>
                 <w:webHidden/>
               </w:rPr>
-              <w:instrText xml:space="preserve"> PAGEREF _Toc224137433 \h </w:instrText>
+              <w:instrText xml:space="preserve"> PAGEREF _Toc224142892 \h </w:instrText>
             </w:r>
             <w:r>
               <w:rPr>
@@ -148,7 +148,7 @@
               <w14:ligatures w14:val="standardContextual"/>
             </w:rPr>
           </w:pPr>
-          <w:hyperlink w:anchor="_Toc224137434" w:history="1">
+          <w:hyperlink w:anchor="_Toc224142893" w:history="1">
             <w:r>
               <w:rPr>
                 <w:rStyle w:val="Hyperlink"/>
@@ -185,7 +185,7 @@
                 <w:noProof/>
                 <w:webHidden/>
               </w:rPr>
-              <w:instrText xml:space="preserve"> PAGEREF _Toc224137434 \h </w:instrText>
+              <w:instrText xml:space="preserve"> PAGEREF _Toc224142893 \h </w:instrText>
             </w:r>
             <w:r>
               <w:rPr>
@@ -231,7 +231,7 @@
               <w14:ligatures w14:val="standardContextual"/>
             </w:rPr>
           </w:pPr>
-          <w:hyperlink w:anchor="_Toc224137435" w:history="1">
+          <w:hyperlink w:anchor="_Toc224142894" w:history="1">
             <w:r>
               <w:rPr>
                 <w:rStyle w:val="Hyperlink"/>
@@ -268,7 +268,7 @@
                 <w:noProof/>
                 <w:webHidden/>
               </w:rPr>
-              <w:instrText xml:space="preserve"> PAGEREF _Toc224137435 \h </w:instrText>
+              <w:instrText xml:space="preserve"> PAGEREF _Toc224142894 \h </w:instrText>
             </w:r>
             <w:r>
               <w:rPr>
@@ -314,7 +314,7 @@
               <w14:ligatures w14:val="standardContextual"/>
             </w:rPr>
           </w:pPr>
-          <w:hyperlink w:anchor="_Toc224137436" w:history="1">
+          <w:hyperlink w:anchor="_Toc224142895" w:history="1">
             <w:r>
               <w:rPr>
                 <w:rStyle w:val="Hyperlink"/>
@@ -351,7 +351,7 @@
                 <w:noProof/>
                 <w:webHidden/>
               </w:rPr>
-              <w:instrText xml:space="preserve"> PAGEREF _Toc224137436 \h </w:instrText>
+              <w:instrText xml:space="preserve"> PAGEREF _Toc224142895 \h </w:instrText>
             </w:r>
             <w:r>
               <w:rPr>
@@ -397,7 +397,7 @@
               <w14:ligatures w14:val="standardContextual"/>
             </w:rPr>
           </w:pPr>
-          <w:hyperlink w:anchor="_Toc224137437" w:history="1">
+          <w:hyperlink w:anchor="_Toc224142896" w:history="1">
             <w:r>
               <w:rPr>
                 <w:rStyle w:val="Hyperlink"/>
@@ -432,7 +432,7 @@
                 <w:noProof/>
                 <w:webHidden/>
               </w:rPr>
-              <w:instrText xml:space="preserve"> PAGEREF _Toc224137437 \h </w:instrText>
+              <w:instrText xml:space="preserve"> PAGEREF _Toc224142896 \h </w:instrText>
             </w:r>
             <w:r>
               <w:rPr>
@@ -478,7 +478,7 @@
               <w14:ligatures w14:val="standardContextual"/>
             </w:rPr>
           </w:pPr>
-          <w:hyperlink w:anchor="_Toc224137438" w:history="1">
+          <w:hyperlink w:anchor="_Toc224142897" w:history="1">
             <w:r>
               <w:rPr>
                 <w:rStyle w:val="Hyperlink"/>
@@ -513,7 +513,7 @@
                 <w:noProof/>
                 <w:webHidden/>
               </w:rPr>
-              <w:instrText xml:space="preserve"> PAGEREF _Toc224137438 \h </w:instrText>
+              <w:instrText xml:space="preserve"> PAGEREF _Toc224142897 \h </w:instrText>
             </w:r>
             <w:r>
               <w:rPr>
@@ -559,7 +559,7 @@
               <w14:ligatures w14:val="standardContextual"/>
             </w:rPr>
           </w:pPr>
-          <w:hyperlink w:anchor="_Toc224137439" w:history="1">
+          <w:hyperlink w:anchor="_Toc224142898" w:history="1">
             <w:r>
               <w:rPr>
                 <w:rStyle w:val="Hyperlink"/>
@@ -594,7 +594,7 @@
                 <w:noProof/>
                 <w:webHidden/>
               </w:rPr>
-              <w:instrText xml:space="preserve"> PAGEREF _Toc224137439 \h </w:instrText>
+              <w:instrText xml:space="preserve"> PAGEREF _Toc224142898 \h </w:instrText>
             </w:r>
             <w:r>
               <w:rPr>
@@ -640,7 +640,7 @@
               <w14:ligatures w14:val="standardContextual"/>
             </w:rPr>
           </w:pPr>
-          <w:hyperlink w:anchor="_Toc224137440" w:history="1">
+          <w:hyperlink w:anchor="_Toc224142899" w:history="1">
             <w:r>
               <w:rPr>
                 <w:rStyle w:val="Hyperlink"/>
@@ -675,7 +675,7 @@
                 <w:noProof/>
                 <w:webHidden/>
               </w:rPr>
-              <w:instrText xml:space="preserve"> PAGEREF _Toc224137440 \h </w:instrText>
+              <w:instrText xml:space="preserve"> PAGEREF _Toc224142899 \h </w:instrText>
             </w:r>
             <w:r>
               <w:rPr>
@@ -721,7 +721,7 @@
               <w14:ligatures w14:val="standardContextual"/>
             </w:rPr>
           </w:pPr>
-          <w:hyperlink w:anchor="_Toc224137441" w:history="1">
+          <w:hyperlink w:anchor="_Toc224142900" w:history="1">
             <w:r>
               <w:rPr>
                 <w:rStyle w:val="Hyperlink"/>
@@ -758,7 +758,7 @@
                 <w:noProof/>
                 <w:webHidden/>
               </w:rPr>
-              <w:instrText xml:space="preserve"> PAGEREF _Toc224137441 \h </w:instrText>
+              <w:instrText xml:space="preserve"> PAGEREF _Toc224142900 \h </w:instrText>
             </w:r>
             <w:r>
               <w:rPr>
@@ -804,7 +804,7 @@
               <w14:ligatures w14:val="standardContextual"/>
             </w:rPr>
           </w:pPr>
-          <w:hyperlink w:anchor="_Toc224137442" w:history="1">
+          <w:hyperlink w:anchor="_Toc224142901" w:history="1">
             <w:r>
               <w:rPr>
                 <w:rStyle w:val="Hyperlink"/>
@@ -841,7 +841,7 @@
                 <w:noProof/>
                 <w:webHidden/>
               </w:rPr>
-              <w:instrText xml:space="preserve"> PAGEREF _Toc224137442 \h </w:instrText>
+              <w:instrText xml:space="preserve"> PAGEREF _Toc224142901 \h </w:instrText>
             </w:r>
             <w:r>
               <w:rPr>
@@ -887,7 +887,7 @@
               <w14:ligatures w14:val="standardContextual"/>
             </w:rPr>
           </w:pPr>
-          <w:hyperlink w:anchor="_Toc224137443" w:history="1">
+          <w:hyperlink w:anchor="_Toc224142902" w:history="1">
             <w:r>
               <w:rPr>
                 <w:rStyle w:val="Hyperlink"/>
@@ -924,7 +924,7 @@
                 <w:noProof/>
                 <w:webHidden/>
               </w:rPr>
-              <w:instrText xml:space="preserve"> PAGEREF _Toc224137443 \h </w:instrText>
+              <w:instrText xml:space="preserve"> PAGEREF _Toc224142902 \h </w:instrText>
             </w:r>
             <w:r>
               <w:rPr>
@@ -970,7 +970,7 @@
               <w14:ligatures w14:val="standardContextual"/>
             </w:rPr>
           </w:pPr>
-          <w:hyperlink w:anchor="_Toc224137444" w:history="1">
+          <w:hyperlink w:anchor="_Toc224142903" w:history="1">
             <w:r>
               <w:rPr>
                 <w:rStyle w:val="Hyperlink"/>
@@ -1007,7 +1007,7 @@
                 <w:noProof/>
                 <w:webHidden/>
               </w:rPr>
-              <w:instrText xml:space="preserve"> PAGEREF _Toc224137444 \h </w:instrText>
+              <w:instrText xml:space="preserve"> PAGEREF _Toc224142903 \h </w:instrText>
             </w:r>
             <w:r>
               <w:rPr>
@@ -1053,7 +1053,7 @@
               <w14:ligatures w14:val="standardContextual"/>
             </w:rPr>
           </w:pPr>
-          <w:hyperlink w:anchor="_Toc224137445" w:history="1">
+          <w:hyperlink w:anchor="_Toc224142904" w:history="1">
             <w:r>
               <w:rPr>
                 <w:rStyle w:val="Hyperlink"/>
@@ -1090,7 +1090,7 @@
                 <w:noProof/>
                 <w:webHidden/>
               </w:rPr>
-              <w:instrText xml:space="preserve"> PAGEREF _Toc224137445 \h </w:instrText>
+              <w:instrText xml:space="preserve"> PAGEREF _Toc224142904 \h </w:instrText>
             </w:r>
             <w:r>
               <w:rPr>
@@ -1136,7 +1136,7 @@
               <w14:ligatures w14:val="standardContextual"/>
             </w:rPr>
           </w:pPr>
-          <w:hyperlink w:anchor="_Toc224137446" w:history="1">
+          <w:hyperlink w:anchor="_Toc224142905" w:history="1">
             <w:r>
               <w:rPr>
                 <w:rStyle w:val="Hyperlink"/>
@@ -1173,7 +1173,7 @@
                 <w:noProof/>
                 <w:webHidden/>
               </w:rPr>
-              <w:instrText xml:space="preserve"> PAGEREF _Toc224137446 \h </w:instrText>
+              <w:instrText xml:space="preserve"> PAGEREF _Toc224142905 \h </w:instrText>
             </w:r>
             <w:r>
               <w:rPr>
@@ -1219,7 +1219,7 @@
               <w14:ligatures w14:val="standardContextual"/>
             </w:rPr>
           </w:pPr>
-          <w:hyperlink w:anchor="_Toc224137447" w:history="1">
+          <w:hyperlink w:anchor="_Toc224142906" w:history="1">
             <w:r>
               <w:rPr>
                 <w:rStyle w:val="Hyperlink"/>
@@ -1254,7 +1254,7 @@
                 <w:noProof/>
                 <w:webHidden/>
               </w:rPr>
-              <w:instrText xml:space="preserve"> PAGEREF _Toc224137447 \h </w:instrText>
+              <w:instrText xml:space="preserve"> PAGEREF _Toc224142906 \h </w:instrText>
             </w:r>
             <w:r>
               <w:rPr>
@@ -1300,7 +1300,7 @@
               <w14:ligatures w14:val="standardContextual"/>
             </w:rPr>
           </w:pPr>
-          <w:hyperlink w:anchor="_Toc224137448" w:history="1">
+          <w:hyperlink w:anchor="_Toc224142907" w:history="1">
             <w:r>
               <w:rPr>
                 <w:rStyle w:val="Hyperlink"/>
@@ -1335,7 +1335,7 @@
                 <w:noProof/>
                 <w:webHidden/>
               </w:rPr>
-              <w:instrText xml:space="preserve"> PAGEREF _Toc224137448 \h </w:instrText>
+              <w:instrText xml:space="preserve"> PAGEREF _Toc224142907 \h </w:instrText>
             </w:r>
             <w:r>
               <w:rPr>
@@ -1381,7 +1381,7 @@
               <w14:ligatures w14:val="standardContextual"/>
             </w:rPr>
           </w:pPr>
-          <w:hyperlink w:anchor="_Toc224137449" w:history="1">
+          <w:hyperlink w:anchor="_Toc224142908" w:history="1">
             <w:r>
               <w:rPr>
                 <w:rStyle w:val="Hyperlink"/>
@@ -1418,7 +1418,7 @@
                 <w:noProof/>
                 <w:webHidden/>
               </w:rPr>
-              <w:instrText xml:space="preserve"> PAGEREF _Toc224137449 \h </w:instrText>
+              <w:instrText xml:space="preserve"> PAGEREF _Toc224142908 \h </w:instrText>
             </w:r>
             <w:r>
               <w:rPr>
@@ -1464,7 +1464,7 @@
               <w14:ligatures w14:val="standardContextual"/>
             </w:rPr>
           </w:pPr>
-          <w:hyperlink w:anchor="_Toc224137450" w:history="1">
+          <w:hyperlink w:anchor="_Toc224142909" w:history="1">
             <w:r>
               <w:rPr>
                 <w:rStyle w:val="Hyperlink"/>
@@ -1501,7 +1501,7 @@
                 <w:noProof/>
                 <w:webHidden/>
               </w:rPr>
-              <w:instrText xml:space="preserve"> PAGEREF _Toc224137450 \h </w:instrText>
+              <w:instrText xml:space="preserve"> PAGEREF _Toc224142909 \h </w:instrText>
             </w:r>
             <w:r>
               <w:rPr>
@@ -1547,7 +1547,7 @@
               <w14:ligatures w14:val="standardContextual"/>
             </w:rPr>
           </w:pPr>
-          <w:hyperlink w:anchor="_Toc224137451" w:history="1">
+          <w:hyperlink w:anchor="_Toc224142910" w:history="1">
             <w:r>
               <w:rPr>
                 <w:rStyle w:val="Hyperlink"/>
@@ -1584,7 +1584,7 @@
                 <w:noProof/>
                 <w:webHidden/>
               </w:rPr>
-              <w:instrText xml:space="preserve"> PAGEREF _Toc224137451 \h </w:instrText>
+              <w:instrText xml:space="preserve"> PAGEREF _Toc224142910 \h </w:instrText>
             </w:r>
             <w:r>
               <w:rPr>
@@ -1630,7 +1630,7 @@
               <w14:ligatures w14:val="standardContextual"/>
             </w:rPr>
           </w:pPr>
-          <w:hyperlink w:anchor="_Toc224137452" w:history="1">
+          <w:hyperlink w:anchor="_Toc224142911" w:history="1">
             <w:r>
               <w:rPr>
                 <w:rStyle w:val="Hyperlink"/>
@@ -1667,7 +1667,7 @@
                 <w:noProof/>
                 <w:webHidden/>
               </w:rPr>
-              <w:instrText xml:space="preserve"> PAGEREF _Toc224137452 \h </w:instrText>
+              <w:instrText xml:space="preserve"> PAGEREF _Toc224142911 \h </w:instrText>
             </w:r>
             <w:r>
               <w:rPr>
@@ -1713,7 +1713,7 @@
               <w14:ligatures w14:val="standardContextual"/>
             </w:rPr>
           </w:pPr>
-          <w:hyperlink w:anchor="_Toc224137453" w:history="1">
+          <w:hyperlink w:anchor="_Toc224142912" w:history="1">
             <w:r>
               <w:rPr>
                 <w:rStyle w:val="Hyperlink"/>
@@ -1750,7 +1750,7 @@
                 <w:noProof/>
                 <w:webHidden/>
               </w:rPr>
-              <w:instrText xml:space="preserve"> PAGEREF _Toc224137453 \h </w:instrText>
+              <w:instrText xml:space="preserve"> PAGEREF _Toc224142912 \h </w:instrText>
             </w:r>
             <w:r>
               <w:rPr>
@@ -1796,7 +1796,7 @@
               <w14:ligatures w14:val="standardContextual"/>
             </w:rPr>
           </w:pPr>
-          <w:hyperlink w:anchor="_Toc224137454" w:history="1">
+          <w:hyperlink w:anchor="_Toc224142913" w:history="1">
             <w:r>
               <w:rPr>
                 <w:rStyle w:val="Hyperlink"/>
@@ -1831,7 +1831,7 @@
                 <w:noProof/>
                 <w:webHidden/>
               </w:rPr>
-              <w:instrText xml:space="preserve"> PAGEREF _Toc224137454 \h </w:instrText>
+              <w:instrText xml:space="preserve"> PAGEREF _Toc224142913 \h </w:instrText>
             </w:r>
             <w:r>
               <w:rPr>
@@ -1877,7 +1877,7 @@
               <w14:ligatures w14:val="standardContextual"/>
             </w:rPr>
           </w:pPr>
-          <w:hyperlink w:anchor="_Toc224137455" w:history="1">
+          <w:hyperlink w:anchor="_Toc224142914" w:history="1">
             <w:r>
               <w:rPr>
                 <w:rStyle w:val="Hyperlink"/>
@@ -1914,7 +1914,7 @@
                 <w:noProof/>
                 <w:webHidden/>
               </w:rPr>
-              <w:instrText xml:space="preserve"> PAGEREF _Toc224137455 \h </w:instrText>
+              <w:instrText xml:space="preserve"> PAGEREF _Toc224142914 \h </w:instrText>
             </w:r>
             <w:r>
               <w:rPr>
@@ -1960,7 +1960,7 @@
               <w14:ligatures w14:val="standardContextual"/>
             </w:rPr>
           </w:pPr>
-          <w:hyperlink w:anchor="_Toc224137456" w:history="1">
+          <w:hyperlink w:anchor="_Toc224142915" w:history="1">
             <w:r>
               <w:rPr>
                 <w:rStyle w:val="Hyperlink"/>
@@ -1995,7 +1995,7 @@
                 <w:noProof/>
                 <w:webHidden/>
               </w:rPr>
-              <w:instrText xml:space="preserve"> PAGEREF _Toc224137456 \h </w:instrText>
+              <w:instrText xml:space="preserve"> PAGEREF _Toc224142915 \h </w:instrText>
             </w:r>
             <w:r>
               <w:rPr>
@@ -2041,7 +2041,7 @@
               <w14:ligatures w14:val="standardContextual"/>
             </w:rPr>
           </w:pPr>
-          <w:hyperlink w:anchor="_Toc224137457" w:history="1">
+          <w:hyperlink w:anchor="_Toc224142916" w:history="1">
             <w:r>
               <w:rPr>
                 <w:rStyle w:val="Hyperlink"/>
@@ -2076,7 +2076,7 @@
                 <w:noProof/>
                 <w:webHidden/>
               </w:rPr>
-              <w:instrText xml:space="preserve"> PAGEREF _Toc224137457 \h </w:instrText>
+              <w:instrText xml:space="preserve"> PAGEREF _Toc224142916 \h </w:instrText>
             </w:r>
             <w:r>
               <w:rPr>
@@ -2122,7 +2122,7 @@
               <w14:ligatures w14:val="standardContextual"/>
             </w:rPr>
           </w:pPr>
-          <w:hyperlink w:anchor="_Toc224137458" w:history="1">
+          <w:hyperlink w:anchor="_Toc224142917" w:history="1">
             <w:r>
               <w:rPr>
                 <w:rStyle w:val="Hyperlink"/>
@@ -2157,7 +2157,7 @@
                 <w:noProof/>
                 <w:webHidden/>
               </w:rPr>
-              <w:instrText xml:space="preserve"> PAGEREF _Toc224137458 \h </w:instrText>
+              <w:instrText xml:space="preserve"> PAGEREF _Toc224142917 \h </w:instrText>
             </w:r>
             <w:r>
               <w:rPr>
@@ -2203,7 +2203,7 @@
               <w14:ligatures w14:val="standardContextual"/>
             </w:rPr>
           </w:pPr>
-          <w:hyperlink w:anchor="_Toc224137459" w:history="1">
+          <w:hyperlink w:anchor="_Toc224142918" w:history="1">
             <w:r>
               <w:rPr>
                 <w:rStyle w:val="Hyperlink"/>
@@ -2240,7 +2240,7 @@
                 <w:noProof/>
                 <w:webHidden/>
               </w:rPr>
-              <w:instrText xml:space="preserve"> PAGEREF _Toc224137459 \h </w:instrText>
+              <w:instrText xml:space="preserve"> PAGEREF _Toc224142918 \h </w:instrText>
             </w:r>
             <w:r>
               <w:rPr>
@@ -2286,7 +2286,7 @@
               <w14:ligatures w14:val="standardContextual"/>
             </w:rPr>
           </w:pPr>
-          <w:hyperlink w:anchor="_Toc224137460" w:history="1">
+          <w:hyperlink w:anchor="_Toc224142919" w:history="1">
             <w:r>
               <w:rPr>
                 <w:rStyle w:val="Hyperlink"/>
@@ -2323,7 +2323,7 @@
                 <w:noProof/>
                 <w:webHidden/>
               </w:rPr>
-              <w:instrText xml:space="preserve"> PAGEREF _Toc224137460 \h </w:instrText>
+              <w:instrText xml:space="preserve"> PAGEREF _Toc224142919 \h </w:instrText>
             </w:r>
             <w:r>
               <w:rPr>
@@ -2369,7 +2369,7 @@
               <w14:ligatures w14:val="standardContextual"/>
             </w:rPr>
           </w:pPr>
-          <w:hyperlink w:anchor="_Toc224137461" w:history="1">
+          <w:hyperlink w:anchor="_Toc224142920" w:history="1">
             <w:r>
               <w:rPr>
                 <w:rStyle w:val="Hyperlink"/>
@@ -2406,7 +2406,7 @@
                 <w:noProof/>
                 <w:webHidden/>
               </w:rPr>
-              <w:instrText xml:space="preserve"> PAGEREF _Toc224137461 \h </w:instrText>
+              <w:instrText xml:space="preserve"> PAGEREF _Toc224142920 \h </w:instrText>
             </w:r>
             <w:r>
               <w:rPr>
@@ -2452,7 +2452,7 @@
               <w14:ligatures w14:val="standardContextual"/>
             </w:rPr>
           </w:pPr>
-          <w:hyperlink w:anchor="_Toc224137462" w:history="1">
+          <w:hyperlink w:anchor="_Toc224142921" w:history="1">
             <w:r>
               <w:rPr>
                 <w:rStyle w:val="Hyperlink"/>
@@ -2489,7 +2489,7 @@
                 <w:noProof/>
                 <w:webHidden/>
               </w:rPr>
-              <w:instrText xml:space="preserve"> PAGEREF _Toc224137462 \h </w:instrText>
+              <w:instrText xml:space="preserve"> PAGEREF _Toc224142921 \h </w:instrText>
             </w:r>
             <w:r>
               <w:rPr>
@@ -2535,7 +2535,7 @@
               <w14:ligatures w14:val="standardContextual"/>
             </w:rPr>
           </w:pPr>
-          <w:hyperlink w:anchor="_Toc224137463" w:history="1">
+          <w:hyperlink w:anchor="_Toc224142922" w:history="1">
             <w:r>
               <w:rPr>
                 <w:rStyle w:val="Hyperlink"/>
@@ -2570,7 +2570,7 @@
                 <w:noProof/>
                 <w:webHidden/>
               </w:rPr>
-              <w:instrText xml:space="preserve"> PAGEREF _Toc224137463 \h </w:instrText>
+              <w:instrText xml:space="preserve"> PAGEREF _Toc224142922 \h </w:instrText>
             </w:r>
             <w:r>
               <w:rPr>
@@ -2602,6 +2602,87 @@
           </w:hyperlink>
         </w:p>
         <w:p>
+          <w:pPr>
+            <w:pStyle w:val="TOC3"/>
+            <w:tabs>
+              <w:tab w:val="right" w:leader="dot" w:pos="9350"/>
+            </w:tabs>
+            <w:rPr>
+              <w:rFonts w:asciiTheme="minorHAnsi" w:eastAsiaTheme="minorEastAsia" w:hAnsiTheme="minorHAnsi" w:cstheme="minorBidi"/>
+              <w:noProof/>
+              <w:kern w:val="2"/>
+              <w:sz w:val="24"/>
+              <w:szCs w:val="24"/>
+              <w14:ligatures w14:val="standardContextual"/>
+            </w:rPr>
+          </w:pPr>
+          <w:hyperlink w:anchor="_Toc224142923" w:history="1">
+            <w:r>
+              <w:rPr>
+                <w:rStyle w:val="Hyperlink"/>
+                <w:rFonts w:ascii="Ubuntu" w:hAnsi="Ubuntu"/>
+                <w:noProof/>
+              </w:rPr>
+              <w:t>4.10</w:t>
+            </w:r>
+            <w:r>
+              <w:rPr>
+                <w:rStyle w:val="Hyperlink"/>
+                <w:noProof/>
+              </w:rPr>
+              <w:t xml:space="preserve"> Count Maximum Consecutive One's</w:t>
+            </w:r>
+            <w:r>
+              <w:rPr>
+                <w:noProof/>
+                <w:webHidden/>
+              </w:rPr>
+              <w:tab/>
+            </w:r>
+            <w:r>
+              <w:rPr>
+                <w:noProof/>
+                <w:webHidden/>
+              </w:rPr>
+              <w:fldChar w:fldCharType="begin"/>
+            </w:r>
+            <w:r>
+              <w:rPr>
+                <w:noProof/>
+                <w:webHidden/>
+              </w:rPr>
+              <w:instrText xml:space="preserve"> PAGEREF _Toc224142923 \h </w:instrText>
+            </w:r>
+            <w:r>
+              <w:rPr>
+                <w:noProof/>
+                <w:webHidden/>
+              </w:rPr>
+            </w:r>
+            <w:r>
+              <w:rPr>
+                <w:noProof/>
+                <w:webHidden/>
+              </w:rPr>
+              <w:fldChar w:fldCharType="separate"/>
+            </w:r>
+            <w:r>
+              <w:rPr>
+                <w:noProof/>
+                <w:webHidden/>
+              </w:rPr>
+              <w:t>43</w:t>
+            </w:r>
+            <w:r>
+              <w:rPr>
+                <w:noProof/>
+                <w:webHidden/>
+              </w:rPr>
+              <w:fldChar w:fldCharType="end"/>
+            </w:r>
+          </w:hyperlink>
+        </w:p>
+        <w:p>
           <w:r>
             <w:rPr>
               <w:b/>
@@ -2628,7 +2709,7 @@
           <w:szCs w:val="28"/>
         </w:rPr>
       </w:pPr>
-      <w:bookmarkStart w:id="0" w:name="_Toc224137433"/>
+      <w:bookmarkStart w:id="0" w:name="_Toc224142892"/>
       <w:r>
         <w:rPr>
           <w:sz w:val="28"/>
@@ -2653,7 +2734,7 @@
           <w:lang w:val="en-IN"/>
         </w:rPr>
       </w:pPr>
-      <w:bookmarkStart w:id="1" w:name="_Toc224137434"/>
+      <w:bookmarkStart w:id="1" w:name="_Toc224142893"/>
       <w:r>
         <w:rPr>
           <w:szCs w:val="28"/>
@@ -3521,7 +3602,7 @@
           <w:lang w:val="en-IN"/>
         </w:rPr>
       </w:pPr>
-      <w:bookmarkStart w:id="2" w:name="_Toc224137435"/>
+      <w:bookmarkStart w:id="2" w:name="_Toc224142894"/>
       <w:r>
         <w:rPr>
           <w:szCs w:val="28"/>
@@ -5069,7 +5150,7 @@
           <w:lang w:val="en-IN"/>
         </w:rPr>
       </w:pPr>
-      <w:bookmarkStart w:id="3" w:name="_Toc224137436"/>
+      <w:bookmarkStart w:id="3" w:name="_Toc224142895"/>
       <w:r>
         <w:rPr>
           <w:szCs w:val="28"/>
@@ -5831,7 +5912,7 @@
           <w:szCs w:val="28"/>
         </w:rPr>
       </w:pPr>
-      <w:bookmarkStart w:id="5" w:name="_Toc224137437"/>
+      <w:bookmarkStart w:id="5" w:name="_Toc224142896"/>
       <w:proofErr w:type="spellStart"/>
       <w:r>
         <w:rPr>
@@ -7769,7 +7850,7 @@
           <w:szCs w:val="28"/>
         </w:rPr>
       </w:pPr>
-      <w:bookmarkStart w:id="6" w:name="_Toc224137438"/>
+      <w:bookmarkStart w:id="6" w:name="_Toc224142897"/>
       <w:r>
         <w:rPr>
           <w:szCs w:val="28"/>
@@ -8650,7 +8731,7 @@
           <w:szCs w:val="28"/>
         </w:rPr>
       </w:pPr>
-      <w:bookmarkStart w:id="7" w:name="_Toc224137439"/>
+      <w:bookmarkStart w:id="7" w:name="_Toc224142898"/>
       <w:r>
         <w:rPr>
           <w:szCs w:val="28"/>
@@ -8906,7 +8987,7 @@
           <w:szCs w:val="28"/>
         </w:rPr>
       </w:pPr>
-      <w:bookmarkStart w:id="8" w:name="_Toc224137440"/>
+      <w:bookmarkStart w:id="8" w:name="_Toc224142899"/>
       <w:r>
         <w:rPr>
           <w:sz w:val="28"/>
@@ -8924,7 +9005,7 @@
           <w:lang w:val="en-IN"/>
         </w:rPr>
       </w:pPr>
-      <w:bookmarkStart w:id="9" w:name="_Toc224137441"/>
+      <w:bookmarkStart w:id="9" w:name="_Toc224142900"/>
       <w:r>
         <w:rPr>
           <w:szCs w:val="28"/>
@@ -9099,7 +9180,7 @@
           <w:lang w:val="en-IN"/>
         </w:rPr>
       </w:pPr>
-      <w:bookmarkStart w:id="10" w:name="_Toc224137442"/>
+      <w:bookmarkStart w:id="10" w:name="_Toc224142901"/>
       <w:r>
         <w:rPr>
           <w:szCs w:val="28"/>
@@ -10019,7 +10100,7 @@
           <w:lang w:val="en-IN"/>
         </w:rPr>
       </w:pPr>
-      <w:bookmarkStart w:id="11" w:name="_Toc224137443"/>
+      <w:bookmarkStart w:id="11" w:name="_Toc224142902"/>
       <w:r>
         <w:rPr>
           <w:szCs w:val="28"/>
@@ -11085,7 +11166,7 @@
           <w:noProof/>
         </w:rPr>
         <w:drawing>
-          <wp:inline distT="0" distB="0" distL="0" distR="0" wp14:anchorId="655250CC" wp14:editId="6A34D247">
+          <wp:inline distT="0" distB="0" distL="0" distR="0" wp14:anchorId="655250CC" wp14:editId="0CAD7B02">
             <wp:extent cx="5943600" cy="3422650"/>
             <wp:effectExtent l="0" t="0" r="0" b="6350"/>
             <wp:docPr id="2034329436" name="Picture 1"/>
@@ -11882,7 +11963,7 @@
           <w:lang w:val="en-IN"/>
         </w:rPr>
       </w:pPr>
-      <w:bookmarkStart w:id="12" w:name="_Toc224137444"/>
+      <w:bookmarkStart w:id="12" w:name="_Toc224142903"/>
       <w:r>
         <w:rPr>
           <w:szCs w:val="28"/>
@@ -12871,7 +12952,7 @@
           <w:lang w:val="en-IN"/>
         </w:rPr>
       </w:pPr>
-      <w:bookmarkStart w:id="13" w:name="_Toc224137445"/>
+      <w:bookmarkStart w:id="13" w:name="_Toc224142904"/>
       <w:r>
         <w:rPr>
           <w:szCs w:val="28"/>
@@ -14764,7 +14845,7 @@
           <w:lang w:val="en-IN"/>
         </w:rPr>
       </w:pPr>
-      <w:bookmarkStart w:id="14" w:name="_Toc224137446"/>
+      <w:bookmarkStart w:id="14" w:name="_Toc224142905"/>
       <w:r>
         <w:rPr>
           <w:szCs w:val="28"/>
@@ -15807,7 +15888,7 @@
           <w:szCs w:val="28"/>
         </w:rPr>
       </w:pPr>
-      <w:bookmarkStart w:id="15" w:name="_Toc224137447"/>
+      <w:bookmarkStart w:id="15" w:name="_Toc224142906"/>
       <w:r>
         <w:rPr>
           <w:sz w:val="28"/>
@@ -15825,7 +15906,7 @@
           <w:szCs w:val="28"/>
         </w:rPr>
       </w:pPr>
-      <w:bookmarkStart w:id="16" w:name="_Toc224137448"/>
+      <w:bookmarkStart w:id="16" w:name="_Toc224142907"/>
       <w:r>
         <w:rPr>
           <w:szCs w:val="28"/>
@@ -16654,7 +16735,7 @@
           <w:lang w:val="en-IN"/>
         </w:rPr>
       </w:pPr>
-      <w:bookmarkStart w:id="17" w:name="_Toc224137449"/>
+      <w:bookmarkStart w:id="17" w:name="_Toc224142908"/>
       <w:r>
         <w:rPr>
           <w:szCs w:val="28"/>
@@ -17001,7 +17082,7 @@
           <w:lang w:val="en-IN"/>
         </w:rPr>
       </w:pPr>
-      <w:bookmarkStart w:id="18" w:name="_Toc224137450"/>
+      <w:bookmarkStart w:id="18" w:name="_Toc224142909"/>
       <w:r>
         <w:rPr>
           <w:szCs w:val="28"/>
@@ -17389,7 +17470,7 @@
           <w:lang w:val="en-IN"/>
         </w:rPr>
       </w:pPr>
-      <w:bookmarkStart w:id="19" w:name="_Toc224137451"/>
+      <w:bookmarkStart w:id="19" w:name="_Toc224142910"/>
       <w:r>
         <w:rPr>
           <w:szCs w:val="28"/>
@@ -17595,7 +17676,7 @@
           <w:lang w:val="en-IN"/>
         </w:rPr>
       </w:pPr>
-      <w:bookmarkStart w:id="20" w:name="_Toc224137452"/>
+      <w:bookmarkStart w:id="20" w:name="_Toc224142911"/>
       <w:r>
         <w:rPr>
           <w:szCs w:val="28"/>
@@ -18171,7 +18252,7 @@
           <w:lang w:val="en-IN"/>
         </w:rPr>
       </w:pPr>
-      <w:bookmarkStart w:id="21" w:name="_Toc224137453"/>
+      <w:bookmarkStart w:id="21" w:name="_Toc224142912"/>
       <w:r>
         <w:rPr>
           <w:szCs w:val="28"/>
@@ -19561,7 +19642,7 @@
           <w:szCs w:val="28"/>
         </w:rPr>
       </w:pPr>
-      <w:bookmarkStart w:id="22" w:name="_Toc224137454"/>
+      <w:bookmarkStart w:id="22" w:name="_Toc224142913"/>
       <w:r>
         <w:rPr>
           <w:sz w:val="28"/>
@@ -19579,7 +19660,7 @@
           <w:lang w:val="en-IN"/>
         </w:rPr>
       </w:pPr>
-      <w:bookmarkStart w:id="23" w:name="_Toc224137455"/>
+      <w:bookmarkStart w:id="23" w:name="_Toc224142914"/>
       <w:r>
         <w:rPr>
           <w:szCs w:val="28"/>
@@ -20350,7 +20431,7 @@
           <w:szCs w:val="28"/>
         </w:rPr>
       </w:pPr>
-      <w:bookmarkStart w:id="24" w:name="_Toc224137456"/>
+      <w:bookmarkStart w:id="24" w:name="_Toc224142915"/>
       <w:r>
         <w:rPr>
           <w:szCs w:val="28"/>
@@ -20900,7 +20981,7 @@
           <w:szCs w:val="28"/>
         </w:rPr>
       </w:pPr>
-      <w:bookmarkStart w:id="25" w:name="_Toc224137457"/>
+      <w:bookmarkStart w:id="25" w:name="_Toc224142916"/>
       <w:r>
         <w:rPr>
           <w:szCs w:val="28"/>
@@ -21861,7 +21942,7 @@
           <w:szCs w:val="28"/>
         </w:rPr>
       </w:pPr>
-      <w:bookmarkStart w:id="26" w:name="_Toc224137458"/>
+      <w:bookmarkStart w:id="26" w:name="_Toc224142917"/>
       <w:r>
         <w:rPr>
           <w:szCs w:val="28"/>
@@ -22331,7 +22412,7 @@
           <w:lang w:val="en-IN"/>
         </w:rPr>
       </w:pPr>
-      <w:bookmarkStart w:id="27" w:name="_Toc224137459"/>
+      <w:bookmarkStart w:id="27" w:name="_Toc224142918"/>
       <w:r>
         <w:rPr>
           <w:szCs w:val="28"/>
@@ -23122,7 +23203,7 @@
           <w:lang w:val="en-IN"/>
         </w:rPr>
       </w:pPr>
-      <w:bookmarkStart w:id="28" w:name="_Toc224137460"/>
+      <w:bookmarkStart w:id="28" w:name="_Toc224142919"/>
       <w:r>
         <w:rPr>
           <w:szCs w:val="28"/>
@@ -24588,7 +24669,7 @@
           <w:lang w:val="en-IN"/>
         </w:rPr>
       </w:pPr>
-      <w:bookmarkStart w:id="29" w:name="_Toc224137461"/>
+      <w:bookmarkStart w:id="29" w:name="_Toc224142920"/>
       <w:r>
         <w:rPr>
           <w:szCs w:val="28"/>
@@ -25450,7 +25531,7 @@
           <w:lang w:val="en-IN"/>
         </w:rPr>
       </w:pPr>
-      <w:bookmarkStart w:id="30" w:name="_Toc224137462"/>
+      <w:bookmarkStart w:id="30" w:name="_Toc224142921"/>
       <w:r>
         <w:rPr>
           <w:lang w:val="en-IN"/>
@@ -26111,7 +26192,7 @@
       <w:pPr>
         <w:pStyle w:val="Heading3"/>
       </w:pPr>
-      <w:bookmarkStart w:id="31" w:name="_Toc224137463"/>
+      <w:bookmarkStart w:id="31" w:name="_Toc224142922"/>
       <w:r>
         <w:t>Remove Duplicates in-place from Sorted Array</w:t>
       </w:r>
@@ -26193,13 +26274,7 @@
       </w:r>
       <w:proofErr w:type="spellEnd"/>
       <w:r>
-        <w:t xml:space="preserve">[1,2,3] and </w:t>
-      </w:r>
-      <w:r>
-        <w:t>therefore</w:t>
-      </w:r>
-      <w:r>
-        <w:t xml:space="preserve"> return 3 after assigning [1,2,3] in the beginning of the array.</w:t>
+        <w:t>[1,2,3] and therefore return 3 after assigning [1,2,3] in the beginning of the array.</w:t>
       </w:r>
     </w:p>
     <w:p>
@@ -26276,13 +26351,7 @@
       </w:r>
       <w:proofErr w:type="spellEnd"/>
       <w:r>
-        <w:t xml:space="preserve">[1,2,3,4] and </w:t>
-      </w:r>
-      <w:r>
-        <w:t>therefore</w:t>
-      </w:r>
-      <w:r>
-        <w:t xml:space="preserve"> return 4 after assigning [1,2,3,4] in the beginning of the array.</w:t>
+        <w:t>[1,2,3,4] and therefore return 4 after assigning [1,2,3,4] in the beginning of the array.</w:t>
       </w:r>
     </w:p>
     <w:p>
@@ -26499,6 +26568,255 @@
       </w:r>
       <w:r>
         <w:t>, constant additional space is used to check unique elements.</w:t>
+      </w:r>
+    </w:p>
+    <w:p>
+      <w:pPr>
+        <w:pStyle w:val="Heading3"/>
+      </w:pPr>
+      <w:bookmarkStart w:id="32" w:name="_Toc224142923"/>
+      <w:r>
+        <w:t>Count Maximum Consecutive One's</w:t>
+      </w:r>
+      <w:bookmarkEnd w:id="32"/>
+    </w:p>
+    <w:p>
+      <w:r>
+        <w:t>Given an array that contains only 1 and 0 return the count of maximum consecutive ones in the array</w:t>
+      </w:r>
+      <w:r>
+        <w:t>.</w:t>
+      </w:r>
+    </w:p>
+    <w:p>
+      <w:r>
+        <w:t>Input: prices = {1, 1, 0, 1, 1, 1}</w:t>
+      </w:r>
+    </w:p>
+    <w:p>
+      <w:r>
+        <w:t>Output: 3</w:t>
+      </w:r>
+    </w:p>
+    <w:p>
+      <w:r>
+        <w:t>Explanation: There are two consecutive 1’s and three consecutive 1’s in the array out of which maximum is 3.</w:t>
+      </w:r>
+    </w:p>
+    <w:p>
+      <w:pPr>
+        <w:rPr>
+          <w:u w:val="single"/>
+        </w:rPr>
+      </w:pPr>
+      <w:r>
+        <w:rPr>
+          <w:u w:val="single"/>
+        </w:rPr>
+        <w:t xml:space="preserve">Approach 1 </w:t>
+      </w:r>
+    </w:p>
+    <w:p>
+      <w:r>
+        <w:lastRenderedPageBreak/>
+        <w:t xml:space="preserve">While looping through the </w:t>
+      </w:r>
+      <w:r>
+        <w:t>array,</w:t>
+      </w:r>
+      <w:r>
+        <w:t xml:space="preserve"> whenever we find a </w:t>
+      </w:r>
+      <w:proofErr w:type="gramStart"/>
+      <w:r>
+        <w:t>1 ,</w:t>
+      </w:r>
+      <w:proofErr w:type="gramEnd"/>
+      <w:r>
+        <w:t xml:space="preserve"> we can check consecutively with next elements if there is 1 (by running a while loop</w:t>
+      </w:r>
+      <w:proofErr w:type="gramStart"/>
+      <w:r>
+        <w:t>) ,</w:t>
+      </w:r>
+      <w:proofErr w:type="gramEnd"/>
+      <w:r>
+        <w:t xml:space="preserve"> so this way we can keep counting the </w:t>
+      </w:r>
+      <w:r>
+        <w:t xml:space="preserve">chunks of </w:t>
+      </w:r>
+      <w:r>
+        <w:t>1’s</w:t>
+      </w:r>
+      <w:r>
+        <w:t xml:space="preserve"> and take max of </w:t>
+      </w:r>
+      <w:proofErr w:type="gramStart"/>
+      <w:r>
+        <w:t>all</w:t>
+      </w:r>
+      <w:proofErr w:type="gramEnd"/>
+      <w:r>
+        <w:t xml:space="preserve"> them.</w:t>
+      </w:r>
+    </w:p>
+    <w:p>
+      <w:r>
+        <w:t xml:space="preserve">If it is not </w:t>
+      </w:r>
+      <w:r>
+        <w:t>1,</w:t>
+      </w:r>
+      <w:r>
+        <w:t xml:space="preserve"> we can simply skip all such numbers from processing.</w:t>
+      </w:r>
+    </w:p>
+    <w:p>
+      <w:r>
+        <w:rPr>
+          <w:b/>
+          <w:bCs/>
+        </w:rPr>
+        <w:t>Time Complexity:</w:t>
+      </w:r>
+      <w:r>
+        <w:t xml:space="preserve"> O(N), </w:t>
+      </w:r>
+      <w:r>
+        <w:t>including processing 1’s and skipping others we will be traversing the array only once.</w:t>
+      </w:r>
+    </w:p>
+    <w:p>
+      <w:r>
+        <w:rPr>
+          <w:b/>
+          <w:bCs/>
+        </w:rPr>
+        <w:t>Space Complexity:</w:t>
+      </w:r>
+      <w:r>
+        <w:t> </w:t>
+      </w:r>
+      <w:proofErr w:type="gramStart"/>
+      <w:r>
+        <w:t>O(</w:t>
+      </w:r>
+      <w:proofErr w:type="gramEnd"/>
+      <w:r>
+        <w:t>1), as only constant extra variables are used.</w:t>
+      </w:r>
+      <w:r>
+        <w:t xml:space="preserve">  </w:t>
+      </w:r>
+    </w:p>
+    <w:p>
+      <w:r>
+        <w:t xml:space="preserve"> </w:t>
+      </w:r>
+    </w:p>
+    <w:p>
+      <w:pPr>
+        <w:rPr>
+          <w:u w:val="single"/>
+        </w:rPr>
+      </w:pPr>
+      <w:r>
+        <w:rPr>
+          <w:u w:val="single"/>
+        </w:rPr>
+        <w:t xml:space="preserve">Approach </w:t>
+      </w:r>
+      <w:r>
+        <w:rPr>
+          <w:u w:val="single"/>
+        </w:rPr>
+        <w:t>2</w:t>
+      </w:r>
+    </w:p>
+    <w:p>
+      <w:r>
+        <w:t xml:space="preserve">This is even easier to think and implement </w:t>
+      </w:r>
+      <w:r>
+        <w:t>also,</w:t>
+      </w:r>
+      <w:r>
+        <w:t xml:space="preserve"> </w:t>
+      </w:r>
+      <w:r>
+        <w:t xml:space="preserve">simple idea is to traverse the array while maintaining a counter. Every time we encounter a 1, we increase the counter. If we encounter a 0, the streak breaks, </w:t>
+      </w:r>
+      <w:r>
+        <w:t xml:space="preserve">we check if the count so far can be of max </w:t>
+      </w:r>
+      <w:r>
+        <w:t xml:space="preserve">length </w:t>
+      </w:r>
+      <w:r>
+        <w:t>and</w:t>
+      </w:r>
+      <w:r>
+        <w:t xml:space="preserve"> reset the counter to 0</w:t>
+      </w:r>
+      <w:r>
+        <w:t>.</w:t>
+      </w:r>
+    </w:p>
+    <w:p>
+      <w:r>
+        <w:t>At end of loop (after loop completion</w:t>
+      </w:r>
+      <w:r>
+        <w:t>),</w:t>
+      </w:r>
+      <w:r>
+        <w:t xml:space="preserve"> we need to </w:t>
+      </w:r>
+      <w:r>
+        <w:t>do this check for max counter again as that’s going to be missing for the last element if it is 1</w:t>
+      </w:r>
+      <w:r>
+        <w:t xml:space="preserve"> </w:t>
+      </w:r>
+      <w:r>
+        <w:t>specially (</w:t>
+      </w:r>
+      <w:r>
+        <w:t>as we don’t go to else block)</w:t>
+      </w:r>
+      <w:r>
+        <w:t>.</w:t>
+      </w:r>
+    </w:p>
+    <w:p>
+      <w:r>
+        <w:rPr>
+          <w:b/>
+          <w:bCs/>
+        </w:rPr>
+        <w:t>Time Complexity:</w:t>
+      </w:r>
+      <w:r>
+        <w:t> O(N), since we scan the array once.</w:t>
+      </w:r>
+    </w:p>
+    <w:p>
+      <w:r>
+        <w:rPr>
+          <w:b/>
+          <w:bCs/>
+        </w:rPr>
+        <w:t>Space Complexity:</w:t>
+      </w:r>
+      <w:r>
+        <w:t> </w:t>
+      </w:r>
+      <w:r>
+        <w:t>O (</w:t>
+      </w:r>
+      <w:r>
+        <w:t>1), as only constant extra variables are used.</w:t>
       </w:r>
     </w:p>
     <w:p/>
@@ -30471,7 +30789,7 @@
   <w:style w:type="paragraph" w:default="1" w:styleId="Normal">
     <w:name w:val="Normal"/>
     <w:qFormat/>
-    <w:rsid w:val="00AC52FB"/>
+    <w:rsid w:val="00726BA1"/>
     <w:rPr>
       <w:rFonts w:ascii="Arial" w:hAnsi="Arial"/>
     </w:rPr>

</xml_diff>